<commit_message>
feat: implement multi-scenario progression tracking, mailbox automation templates, and graph index management tools
</commit_message>
<xml_diff>
--- a/docs/Notes KB/Architecture-as-a-living-asset-base.docx
+++ b/docs/Notes KB/Architecture-as-a-living-asset-base.docx
@@ -261,7 +261,7 @@
           <w:sz w:val="22"/>
           <w:szCs w:val="22"/>
         </w:rPr>
-        <w:t xml:space="preserve">This is the same move we make routinely in engineering and rarely in architecture: separate state from presentation, keep the state structured, and generate the presentation. The consequences are immediate. A correction is made once, in one asset, and every future document inherits it. A claim can be traced to the asset that supports it. And a machine can read the base precisely, because it is reading whole typed objects rather than fragments of prose recovered by similarity.</w:t>
+        <w:t xml:space="preserve">This is the same move we make routinely in engineering and rarely in architecture: separate state from presentation, keep the state structured, generate the presentation. A correction is then made once, in one asset, and every future document inherits it. A claim can be traced to the asset that supports it. And a machine can read the base precisely, because it is reading whole typed objects rather than fragments of prose recovered by similarity.</w:t>
       </w:r>
     </w:p>
     <w:p>
@@ -274,7 +274,7 @@
           <w:sz w:val="22"/>
           <w:szCs w:val="22"/>
         </w:rPr>
-        <w:t xml:space="preserve">The base is a single Git repository. Everything in it carries a typed metadata header — identity, status, confidence, applicable phase and domain, owner, date of last review — which is validated automatically. That header is what makes the base machine-consumable; without it, we would have a wiki with better intentions.</w:t>
+        <w:t xml:space="preserve">The base is a single Git repository. Everything in it carries a typed metadata header — identity, status, confidence, applicable phase and domain, owner, date of last review — validated automatically. That header is what makes the base machine-consumable; without it we would have a wiki with better intentions.</w:t>
       </w:r>
     </w:p>
     <w:p>
@@ -349,7 +349,7 @@
           <w:sz w:val="22"/>
           <w:szCs w:val="22"/>
         </w:rPr>
-        <w:t xml:space="preserve">Agents read the base through a server exposing typed tools, filtered by phase and domain, returning whole assets. They may draft, and they open a reviewed pull request to do so. They never write directly. That constraint is not caution for its own sake: it is what keeps the base a body of reviewed knowledge rather than a corpus that has quietly generated itself.</w:t>
+        <w:t xml:space="preserve">Agents read through a server exposing typed tools, filtered by phase and domain, returning whole assets. They may draft, and they open a reviewed pull request to do so. They never write directly. That constraint is what keeps the base a body of reviewed knowledge rather than a corpus that has quietly generated itself.</w:t>
       </w:r>
     </w:p>
     <w:p>
@@ -867,7 +867,7 @@
                 <w:sz w:val="20"/>
                 <w:szCs w:val="20"/>
               </w:rPr>
-              <w:t xml:space="preserve">Risks with mitigations and a record of where each one actually materialised</w:t>
+              <w:t xml:space="preserve">Risks with mitigations and a record of where each actually materialised</w:t>
             </w:r>
           </w:p>
         </w:tc>
@@ -983,7 +983,55 @@
           <w:sz w:val="22"/>
           <w:szCs w:val="22"/>
         </w:rPr>
-        <w:t xml:space="preserve">Two mechanisms keep the base small enough to be read. Nothing enters the reusable core from a single engagement: an asset is promoted only on its second occurrence, on a different engagement, stripped of anything client-identifying. And nothing is deleted: an asset that no longer holds is marked superseded and linked to its successor, because the trail of a reversed decision is often more instructive than the decision itself.</w:t>
+        <w:t xml:space="preserve">Two mechanisms keep it small enough to be read. Nothing enters the reusable core from a single engagement: an asset is promoted only on its second occurrence, on a different engagement, stripped of anything client-identifying. And nothing is deleted: an asset that no longer holds is marked superseded and linked to its successor, because the trail of a reversed decision is often more instructive than the decision itself.</w:t>
+      </w:r>
+    </w:p>
+    <w:p>
+      <w:pPr>
+        <w:pStyle w:val="Heading2"/>
+        <w:spacing w:after="150" w:before="300"/>
+      </w:pPr>
+      <w:r>
+        <w:t xml:space="preserve">3.1 Confidence is data, not tone</w:t>
+      </w:r>
+    </w:p>
+    <w:p>
+      <w:pPr>
+        <w:spacing w:after="150" w:line="300"/>
+        <w:jc w:val="both"/>
+      </w:pPr>
+      <w:r>
+        <w:rPr>
+          <w:sz w:val="22"/>
+          <w:szCs w:val="22"/>
+        </w:rPr>
+        <w:t xml:space="preserve">Every asset declares whether what it asserts was directly observed, stated by a vendor, or assumed. This is the most consequential field in the schema, and it exists because of a specific failure mode: a language model restates an assumption with exactly the same assurance as a fact, and a reader cannot tell. Carrying the epistemic status as data means every tool response, every generated paragraph and every claim in a proposal can be qualified automatically.</w:t>
+      </w:r>
+    </w:p>
+    <w:p>
+      <w:pPr>
+        <w:spacing w:after="150" w:line="300"/>
+        <w:jc w:val="both"/>
+      </w:pPr>
+      <w:r>
+        <w:rPr>
+          <w:sz w:val="22"/>
+          <w:szCs w:val="22"/>
+        </w:rPr>
+        <w:t xml:space="preserve">Automation enforces it rather than trusting discipline. A vendor-stated assertion unreviewed for a year is downgraded to assumed by the validator. A draft asset surviving two harvests without promotion is deleted, because a permanently draft asset is noise.</w:t>
+      </w:r>
+    </w:p>
+    <w:p>
+      <w:pPr>
+        <w:spacing w:after="150" w:line="300"/>
+        <w:jc w:val="both"/>
+      </w:pPr>
+      <w:r>
+        <w:rPr>
+          <w:sz w:val="22"/>
+          <w:szCs w:val="22"/>
+        </w:rPr>
+        <w:t xml:space="preserve">At proposal time this becomes the claims register: one row per statement a customer could hold us to, each carrying an evidence level of proven, designed, vendor-stated or aspirational. Anything aspirational is reworded as a trajectory the architecture supports, or dropped. Moderating a claim becomes a mechanical step in a review rather than an argument between an architect and a bid manager.</w:t>
       </w:r>
     </w:p>
     <w:p>
@@ -992,7 +1040,7 @@
         <w:spacing w:after="180" w:before="380"/>
       </w:pPr>
       <w:r>
-        <w:t xml:space="preserve">4. Confidence is data, not tone</w:t>
+        <w:t xml:space="preserve">4. How a document gets made</w:t>
       </w:r>
     </w:p>
     <w:p>
@@ -1005,7 +1053,7 @@
           <w:sz w:val="22"/>
           <w:szCs w:val="22"/>
         </w:rPr>
-        <w:t xml:space="preserve">Every asset declares whether what it asserts was directly observed, stated by a vendor, or assumed. This is the single most consequential field in the schema, and it exists because of a specific failure mode: a language model will restate an assumption with exactly the same assurance as a fact, and a reader cannot tell the difference. Carrying the epistemic status as data means every tool response, every generated paragraph and every claim in a proposal can be qualified automatically.</w:t>
+        <w:t xml:space="preserve">We built this in two iterations, and the second is where it landed.</w:t>
       </w:r>
     </w:p>
     <w:p>
@@ -1018,7 +1066,7 @@
           <w:sz w:val="22"/>
           <w:szCs w:val="22"/>
         </w:rPr>
-        <w:t xml:space="preserve">Automation enforces it rather than trusting discipline. A vendor-stated assertion that has not been reviewed for a year is downgraded to assumed by the validator. A draft asset that survives two harvests without being promoted is deleted, because a permanently draft asset is noise.</w:t>
+        <w:t xml:space="preserve">The first was an orchestrated pipeline for a single author: an engagement brief plus the base, four passes — capability check, planning, drafting, assembly — with a human gate between each. It works, it is in service, and it remains the right tool when one architect owns a document end to end. Its most valuable output turned out not to be the prose but the gap list produced before drafting: what the base cannot cover, what the brief is missing, which vendor answers are being quietly assumed.</w:t>
       </w:r>
     </w:p>
     <w:p>
@@ -1031,16 +1079,7 @@
           <w:sz w:val="22"/>
           <w:szCs w:val="22"/>
         </w:rPr>
-        <w:t xml:space="preserve">At proposal time this becomes the claims register: one row per statement a customer could hold us to, each carrying an evidence level of proven, designed, vendor-stated or aspirational. Anything aspirational is reworded as a trajectory the architecture supports, or dropped. Moderating a claim becomes a mechanical step in a review rather than an argument between an architect and a bid manager — and it is the cheapest insurance available against failing a technical evaluation for over-claiming.</w:t>
-      </w:r>
-    </w:p>
-    <w:p>
-      <w:pPr>
-        <w:pStyle w:val="Heading1"/>
-        <w:spacing w:after="180" w:before="380"/>
-      </w:pPr>
-      <w:r>
-        <w:t xml:space="preserve">5. Producing a document, first model: the orchestrated pipeline</w:t>
+        <w:t xml:space="preserve">But real architecture work is collective. Several experts hold different pieces, none holds the whole, and they share neither vocabulary nor scope. Applied to that situation the pipeline breaks in two ways: prose edited in parallel produces merge conflicts and, worse, semantic contradictions nobody notices; and a single author must interview everyone anyway, becoming a bottleneck who transcribes rather than an architect who decides.</w:t>
       </w:r>
     </w:p>
     <w:p>
@@ -1053,7 +1092,7 @@
           <w:sz w:val="22"/>
           <w:szCs w:val="22"/>
         </w:rPr>
-        <w:t xml:space="preserve">The first way of assembling a document suits a single author with a defined scope. Three inputs meet: the reusable base, an engagement brief holding the facts the base cannot know, and a blueprint structure. Four passes follow, with a human decision between each.</w:t>
+        <w:t xml:space="preserve">So the model inverts. The system holds the goal — fill in what is missing for this engagement — and interrogates the experts. It is a chatbot in reverse: the initiative sits with the process, the knowledge with the humans.</w:t>
       </w:r>
     </w:p>
     <w:p>
@@ -1064,7 +1103,7 @@
       <w:r>
         <w:drawing>
           <wp:inline distT="0" distB="0" distL="0" distR="0">
-            <wp:extent cx="5715000" cy="3524250"/>
+            <wp:extent cx="5715000" cy="3171825"/>
             <wp:effectExtent t="0" r="0" b="0" l="0"/>
             <wp:docPr id="1" name="" descr="" title=""/>
             <wp:cNvGraphicFramePr>
@@ -1089,7 +1128,7 @@
                   <pic:spPr bwMode="auto">
                     <a:xfrm>
                       <a:off x="0" y="0"/>
-                      <a:ext cx="5715000" cy="3524250"/>
+                      <a:ext cx="5715000" cy="3171825"/>
                     </a:xfrm>
                     <a:prstGeom prst="rect">
                       <a:avLst/>
@@ -1115,7 +1154,16 @@
           <w:sz w:val="19"/>
           <w:szCs w:val="19"/>
         </w:rPr>
-        <w:t xml:space="preserve">Figure 2 — Four passes, four inputs, and a human gate between each</w:t>
+        <w:t xml:space="preserve">Figure 2 — Multi-expert contribution: framed conversation, typed statements, checks, arbitration</w:t>
+      </w:r>
+    </w:p>
+    <w:p>
+      <w:pPr>
+        <w:pStyle w:val="Heading2"/>
+        <w:spacing w:after="150" w:before="300"/>
+      </w:pPr>
+      <w:r>
+        <w:t xml:space="preserve">4.1 Statements, not prose</w:t>
       </w:r>
     </w:p>
     <w:p>
@@ -1128,7 +1176,16 @@
           <w:sz w:val="22"/>
           <w:szCs w:val="22"/>
         </w:rPr>
-        <w:t xml:space="preserve">The pass that matters is the second. It produces an inventory of what the base offers per section, a check of what the brief actually covers, and — the point of the exercise — a list of gaps. A gap is not a defect of the tool; it is the tool telling you what you do not yet know. Each one is either an asset somebody should write, an entry the architect must add to the brief, or a vendor answer that has not arrived. Drafting around a gap with plausible prose is precisely what this apparatus exists to prevent.</w:t>
+        <w:t xml:space="preserve">The unit of contribution is not a paragraph. Each contribution is recorded as typed statements — a subject, a predicate from a controlled list, a value — plus the author, the confidence and the expert's own words kept verbatim. Prose is generated from the statements; contradictions become detectable by query rather than by proofreading.</w:t>
+      </w:r>
+    </w:p>
+    <w:p>
+      <w:pPr>
+        <w:pStyle w:val="Heading2"/>
+        <w:spacing w:after="150" w:before="300"/>
+      </w:pPr>
+      <w:r>
+        <w:t xml:space="preserve">4.2 Two ways a disagreement surfaces</w:t>
       </w:r>
     </w:p>
     <w:p>
@@ -1141,7 +1198,740 @@
           <w:sz w:val="22"/>
           <w:szCs w:val="22"/>
         </w:rPr>
-        <w:t xml:space="preserve">Drafting then proceeds section by section, cached, so that iterating on one section does not regenerate the document. Assembly resolves figures by running the generators, runs consistency checks — banned wording, dangling cross-references, undrafted sections — and produces the document with its defect report attached.</w:t>
+        <w:t xml:space="preserve">A contributor can contest a statement explicitly: they read a draft, disagree, and say so. That is a declaration, and it surfaces the disagreements people already know they have. The harder and more valuable case is the one nobody notices — two experts answering different questions, weeks apart, recording statements that cannot both hold. Those are found by query over the recorded statements, not by anyone reading carefully.</w:t>
+      </w:r>
+    </w:p>
+    <w:p>
+      <w:pPr>
+        <w:spacing w:after="150" w:line="300"/>
+        <w:jc w:val="both"/>
+      </w:pPr>
+      <w:r>
+        <w:rPr>
+          <w:sz w:val="22"/>
+          <w:szCs w:val="22"/>
+        </w:rPr>
+        <w:t xml:space="preserve">The distinction matters because a system that only supports the first is doing the easy half. Both are recorded with their origin, so a conflict raised by a person is never confused with one found by the machine, and so that the second capability can be tested rather than assumed.</w:t>
+      </w:r>
+    </w:p>
+    <w:p>
+      <w:pPr>
+        <w:pStyle w:val="Heading2"/>
+        <w:spacing w:after="150" w:before="300"/>
+      </w:pPr>
+      <w:r>
+        <w:t xml:space="preserve">4.3 The question is where the quality is</w:t>
+      </w:r>
+    </w:p>
+    <w:p>
+      <w:pPr>
+        <w:spacing w:after="150" w:line="300"/>
+        <w:jc w:val="both"/>
+      </w:pPr>
+      <w:r>
+        <w:rPr>
+          <w:sz w:val="22"/>
+          <w:szCs w:val="22"/>
+        </w:rPr>
+        <w:t xml:space="preserve">A diffuse absence is not a question. Crystallising a gap means producing something answerable in one or two sentences by one identified person, carrying four things: why it matters and what it blocks, the canonical vocabulary to use, the shape of the expected answer, and — where the base has one — what a previous engagement answered.</w:t>
+      </w:r>
+    </w:p>
+    <w:p>
+      <w:pPr>
+        <w:spacing w:after="150" w:line="300"/>
+        <w:jc w:val="both"/>
+      </w:pPr>
+      <w:r>
+        <w:rPr>
+          <w:sz w:val="22"/>
+          <w:szCs w:val="22"/>
+        </w:rPr>
+        <w:t xml:space="preserve">That last element is the reuse mechanism. Instead of an open question, the expert is shown a default and asked to confirm or diverge. The delta becomes the contribution. Presenting the canonical vocabulary also solves the hardest problem in this design: if one expert says 'the management cluster' and another 'the administration zone', no contradiction is ever detected because the system does not know they mean the same thing. Serving the term with the question makes the answer attach to the right subject by construction — elicitation is the normalisation mechanism.</w:t>
+      </w:r>
+    </w:p>
+    <w:p>
+      <w:pPr>
+        <w:spacing w:after="150" w:line="300"/>
+        <w:jc w:val="both"/>
+      </w:pPr>
+      <w:r>
+        <w:rPr>
+          <w:sz w:val="22"/>
+          <w:szCs w:val="22"/>
+        </w:rPr>
+        <w:t xml:space="preserve">Because a well-crystallised question is narrow, and a narrow question asked out of context is unanswerable, every card also carries two permanent links: everything already recorded about the subject, and the section of the draft as it currently stands. The first is usually the more useful. This only works if the draft is never stale, which is why rendering is per section and runs after every confirmation.</w:t>
+      </w:r>
+    </w:p>
+    <w:p>
+      <w:pPr>
+        <w:pStyle w:val="Heading1"/>
+        <w:spacing w:after="180" w:before="380"/>
+      </w:pPr>
+      <w:r>
+        <w:t xml:space="preserve">5. Semantic refinement, subject by subject</w:t>
+      </w:r>
+    </w:p>
+    <w:p>
+      <w:pPr>
+        <w:spacing w:after="150" w:line="300"/>
+        <w:jc w:val="both"/>
+      </w:pPr>
+      <w:r>
+        <w:rPr>
+          <w:sz w:val="22"/>
+          <w:szCs w:val="22"/>
+        </w:rPr>
+        <w:t xml:space="preserve">A first design gave the whole engagement one cadence: structural questions, then mechanisms, then parameters. It was wrong, and usefully so. Subjects do not mature at the same rate: one may be at parameter level while another has barely been named. Refinement happens per subject, each at its own pace.</w:t>
+      </w:r>
+    </w:p>
+    <w:p>
+      <w:pPr>
+        <w:spacing w:after="150" w:line="300"/>
+        <w:jc w:val="both"/>
+      </w:pPr>
+      <w:r>
+        <w:rPr>
+          <w:sz w:val="22"/>
+          <w:szCs w:val="22"/>
+        </w:rPr>
+        <w:t xml:space="preserve">A new subject is treated coarsely first, then decomposed, then decided, then specified. Each level determines what kind of question is asked about it, and what the base can contribute.</w:t>
+      </w:r>
+    </w:p>
+    <w:tbl>
+      <w:tblPr>
+        <w:tblW w:type="dxa" w:w="9360"/>
+        <w:tblBorders>
+          <w:top w:val="single" w:color="auto" w:sz="4"/>
+          <w:left w:val="single" w:color="auto" w:sz="4"/>
+          <w:bottom w:val="single" w:color="auto" w:sz="4"/>
+          <w:right w:val="single" w:color="auto" w:sz="4"/>
+          <w:insideH w:val="single" w:color="auto" w:sz="4"/>
+          <w:insideV w:val="single" w:color="auto" w:sz="4"/>
+        </w:tblBorders>
+      </w:tblPr>
+      <w:tblGrid>
+        <w:gridCol w:w="1500"/>
+        <w:gridCol w:w="3200"/>
+        <w:gridCol w:w="2200"/>
+        <w:gridCol w:w="2460"/>
+      </w:tblGrid>
+      <w:tr>
+        <w:trPr>
+          <w:tblHeader/>
+        </w:trPr>
+        <w:tc>
+          <w:tcPr>
+            <w:tcW w:type="dxa" w:w="1500"/>
+            <w:shd w:fill="DDE5F2" w:val="clear"/>
+            <w:tcMar>
+              <w:top w:type="dxa" w:w="80"/>
+              <w:left w:type="dxa" w:w="120"/>
+              <w:bottom w:type="dxa" w:w="80"/>
+              <w:right w:type="dxa" w:w="120"/>
+            </w:tcMar>
+          </w:tcPr>
+          <w:p>
+            <w:pPr>
+              <w:spacing w:after="0" w:line="260"/>
+            </w:pPr>
+            <w:r>
+              <w:rPr>
+                <w:b/>
+                <w:bCs/>
+                <w:sz w:val="20"/>
+                <w:szCs w:val="20"/>
+              </w:rPr>
+              <w:t xml:space="preserve">Level</w:t>
+            </w:r>
+          </w:p>
+        </w:tc>
+        <w:tc>
+          <w:tcPr>
+            <w:tcW w:type="dxa" w:w="3200"/>
+            <w:shd w:fill="DDE5F2" w:val="clear"/>
+            <w:tcMar>
+              <w:top w:type="dxa" w:w="80"/>
+              <w:left w:type="dxa" w:w="120"/>
+              <w:bottom w:type="dxa" w:w="80"/>
+              <w:right w:type="dxa" w:w="120"/>
+            </w:tcMar>
+          </w:tcPr>
+          <w:p>
+            <w:pPr>
+              <w:spacing w:after="0" w:line="260"/>
+            </w:pPr>
+            <w:r>
+              <w:rPr>
+                <w:b/>
+                <w:bCs/>
+                <w:sz w:val="20"/>
+                <w:szCs w:val="20"/>
+              </w:rPr>
+              <w:t xml:space="preserve">The question asks</w:t>
+            </w:r>
+          </w:p>
+        </w:tc>
+        <w:tc>
+          <w:tcPr>
+            <w:tcW w:type="dxa" w:w="2200"/>
+            <w:shd w:fill="DDE5F2" w:val="clear"/>
+            <w:tcMar>
+              <w:top w:type="dxa" w:w="80"/>
+              <w:left w:type="dxa" w:w="120"/>
+              <w:bottom w:type="dxa" w:w="80"/>
+              <w:right w:type="dxa" w:w="120"/>
+            </w:tcMar>
+          </w:tcPr>
+          <w:p>
+            <w:pPr>
+              <w:spacing w:after="0" w:line="260"/>
+            </w:pPr>
+            <w:r>
+              <w:rPr>
+                <w:b/>
+                <w:bCs/>
+                <w:sz w:val="20"/>
+                <w:szCs w:val="20"/>
+              </w:rPr>
+              <w:t xml:space="preserve">It advances when</w:t>
+            </w:r>
+          </w:p>
+        </w:tc>
+        <w:tc>
+          <w:tcPr>
+            <w:tcW w:type="dxa" w:w="2460"/>
+            <w:shd w:fill="DDE5F2" w:val="clear"/>
+            <w:tcMar>
+              <w:top w:type="dxa" w:w="80"/>
+              <w:left w:type="dxa" w:w="120"/>
+              <w:bottom w:type="dxa" w:w="80"/>
+              <w:right w:type="dxa" w:w="120"/>
+            </w:tcMar>
+          </w:tcPr>
+          <w:p>
+            <w:pPr>
+              <w:spacing w:after="0" w:line="260"/>
+            </w:pPr>
+            <w:r>
+              <w:rPr>
+                <w:b/>
+                <w:bCs/>
+                <w:sz w:val="20"/>
+                <w:szCs w:val="20"/>
+              </w:rPr>
+              <w:t xml:space="preserve">The base contributes</w:t>
+            </w:r>
+          </w:p>
+        </w:tc>
+      </w:tr>
+      <w:tr>
+        <w:tc>
+          <w:tcPr>
+            <w:tcW w:type="dxa" w:w="1500"/>
+            <w:tcMar>
+              <w:top w:type="dxa" w:w="80"/>
+              <w:left w:type="dxa" w:w="120"/>
+              <w:bottom w:type="dxa" w:w="80"/>
+              <w:right w:type="dxa" w:w="120"/>
+            </w:tcMar>
+          </w:tcPr>
+          <w:p>
+            <w:pPr>
+              <w:spacing w:after="0" w:line="260"/>
+            </w:pPr>
+            <w:r>
+              <w:rPr>
+                <w:sz w:val="20"/>
+                <w:szCs w:val="20"/>
+              </w:rPr>
+              <w:t xml:space="preserve">L0 named</w:t>
+            </w:r>
+          </w:p>
+        </w:tc>
+        <w:tc>
+          <w:tcPr>
+            <w:tcW w:type="dxa" w:w="3200"/>
+            <w:tcMar>
+              <w:top w:type="dxa" w:w="80"/>
+              <w:left w:type="dxa" w:w="120"/>
+              <w:bottom w:type="dxa" w:w="80"/>
+              <w:right w:type="dxa" w:w="120"/>
+            </w:tcMar>
+          </w:tcPr>
+          <w:p>
+            <w:pPr>
+              <w:spacing w:after="0" w:line="260"/>
+            </w:pPr>
+            <w:r>
+              <w:rPr>
+                <w:sz w:val="20"/>
+                <w:szCs w:val="20"/>
+              </w:rPr>
+              <w:t xml:space="preserve">nothing — the term exists, no more</w:t>
+            </w:r>
+          </w:p>
+        </w:tc>
+        <w:tc>
+          <w:tcPr>
+            <w:tcW w:type="dxa" w:w="2200"/>
+            <w:tcMar>
+              <w:top w:type="dxa" w:w="80"/>
+              <w:left w:type="dxa" w:w="120"/>
+              <w:bottom w:type="dxa" w:w="80"/>
+              <w:right w:type="dxa" w:w="120"/>
+            </w:tcMar>
+          </w:tcPr>
+          <w:p>
+            <w:pPr>
+              <w:spacing w:after="0" w:line="260"/>
+            </w:pPr>
+            <w:r>
+              <w:rPr>
+                <w:sz w:val="20"/>
+                <w:szCs w:val="20"/>
+              </w:rPr>
+              <w:t xml:space="preserve">a statement mentions it</w:t>
+            </w:r>
+          </w:p>
+        </w:tc>
+        <w:tc>
+          <w:tcPr>
+            <w:tcW w:type="dxa" w:w="2460"/>
+            <w:tcMar>
+              <w:top w:type="dxa" w:w="80"/>
+              <w:left w:type="dxa" w:w="120"/>
+              <w:bottom w:type="dxa" w:w="80"/>
+              <w:right w:type="dxa" w:w="120"/>
+            </w:tcMar>
+          </w:tcPr>
+          <w:p>
+            <w:pPr>
+              <w:spacing w:after="0" w:line="260"/>
+            </w:pPr>
+            <w:r>
+              <w:rPr>
+                <w:sz w:val="20"/>
+                <w:szCs w:val="20"/>
+              </w:rPr>
+              <w:t xml:space="preserve">the canonical term</w:t>
+            </w:r>
+          </w:p>
+        </w:tc>
+      </w:tr>
+      <w:tr>
+        <w:tc>
+          <w:tcPr>
+            <w:tcW w:type="dxa" w:w="1500"/>
+            <w:shd w:fill="F5F7FB" w:val="clear"/>
+            <w:tcMar>
+              <w:top w:type="dxa" w:w="80"/>
+              <w:left w:type="dxa" w:w="120"/>
+              <w:bottom w:type="dxa" w:w="80"/>
+              <w:right w:type="dxa" w:w="120"/>
+            </w:tcMar>
+          </w:tcPr>
+          <w:p>
+            <w:pPr>
+              <w:spacing w:after="0" w:line="260"/>
+            </w:pPr>
+            <w:r>
+              <w:rPr>
+                <w:sz w:val="20"/>
+                <w:szCs w:val="20"/>
+              </w:rPr>
+              <w:t xml:space="preserve">L1 framed</w:t>
+            </w:r>
+          </w:p>
+        </w:tc>
+        <w:tc>
+          <w:tcPr>
+            <w:tcW w:type="dxa" w:w="3200"/>
+            <w:shd w:fill="F5F7FB" w:val="clear"/>
+            <w:tcMar>
+              <w:top w:type="dxa" w:w="80"/>
+              <w:left w:type="dxa" w:w="120"/>
+              <w:bottom w:type="dxa" w:w="80"/>
+              <w:right w:type="dxa" w:w="120"/>
+            </w:tcMar>
+          </w:tcPr>
+          <w:p>
+            <w:pPr>
+              <w:spacing w:after="0" w:line="260"/>
+            </w:pPr>
+            <w:r>
+              <w:rPr>
+                <w:sz w:val="20"/>
+                <w:szCs w:val="20"/>
+              </w:rPr>
+              <w:t xml:space="preserve">what it is for, its boundary, what must hold</w:t>
+            </w:r>
+          </w:p>
+        </w:tc>
+        <w:tc>
+          <w:tcPr>
+            <w:tcW w:type="dxa" w:w="2200"/>
+            <w:shd w:fill="F5F7FB" w:val="clear"/>
+            <w:tcMar>
+              <w:top w:type="dxa" w:w="80"/>
+              <w:left w:type="dxa" w:w="120"/>
+              <w:bottom w:type="dxa" w:w="80"/>
+              <w:right w:type="dxa" w:w="120"/>
+            </w:tcMar>
+          </w:tcPr>
+          <w:p>
+            <w:pPr>
+              <w:spacing w:after="0" w:line="260"/>
+            </w:pPr>
+            <w:r>
+              <w:rPr>
+                <w:sz w:val="20"/>
+                <w:szCs w:val="20"/>
+              </w:rPr>
+              <w:t xml:space="preserve">the problem is stated, not the solution</w:t>
+            </w:r>
+          </w:p>
+        </w:tc>
+        <w:tc>
+          <w:tcPr>
+            <w:tcW w:type="dxa" w:w="2460"/>
+            <w:shd w:fill="F5F7FB" w:val="clear"/>
+            <w:tcMar>
+              <w:top w:type="dxa" w:w="80"/>
+              <w:left w:type="dxa" w:w="120"/>
+              <w:bottom w:type="dxa" w:w="80"/>
+              <w:right w:type="dxa" w:w="120"/>
+            </w:tcMar>
+          </w:tcPr>
+          <w:p>
+            <w:pPr>
+              <w:spacing w:after="0" w:line="260"/>
+            </w:pPr>
+            <w:r>
+              <w:rPr>
+                <w:sz w:val="20"/>
+                <w:szCs w:val="20"/>
+              </w:rPr>
+              <w:t xml:space="preserve">the principles that constrain it</w:t>
+            </w:r>
+          </w:p>
+        </w:tc>
+      </w:tr>
+      <w:tr>
+        <w:tc>
+          <w:tcPr>
+            <w:tcW w:type="dxa" w:w="1500"/>
+            <w:tcMar>
+              <w:top w:type="dxa" w:w="80"/>
+              <w:left w:type="dxa" w:w="120"/>
+              <w:bottom w:type="dxa" w:w="80"/>
+              <w:right w:type="dxa" w:w="120"/>
+            </w:tcMar>
+          </w:tcPr>
+          <w:p>
+            <w:pPr>
+              <w:spacing w:after="0" w:line="260"/>
+            </w:pPr>
+            <w:r>
+              <w:rPr>
+                <w:sz w:val="20"/>
+                <w:szCs w:val="20"/>
+              </w:rPr>
+              <w:t xml:space="preserve">L2 decomposed</w:t>
+            </w:r>
+          </w:p>
+        </w:tc>
+        <w:tc>
+          <w:tcPr>
+            <w:tcW w:type="dxa" w:w="3200"/>
+            <w:tcMar>
+              <w:top w:type="dxa" w:w="80"/>
+              <w:left w:type="dxa" w:w="120"/>
+              <w:bottom w:type="dxa" w:w="80"/>
+              <w:right w:type="dxa" w:w="120"/>
+            </w:tcMar>
+          </w:tcPr>
+          <w:p>
+            <w:pPr>
+              <w:spacing w:after="0" w:line="260"/>
+            </w:pPr>
+            <w:r>
+              <w:rPr>
+                <w:sz w:val="20"/>
+                <w:szCs w:val="20"/>
+              </w:rPr>
+              <w:t xml:space="preserve">what parts it breaks into</w:t>
+            </w:r>
+          </w:p>
+        </w:tc>
+        <w:tc>
+          <w:tcPr>
+            <w:tcW w:type="dxa" w:w="2200"/>
+            <w:tcMar>
+              <w:top w:type="dxa" w:w="80"/>
+              <w:left w:type="dxa" w:w="120"/>
+              <w:bottom w:type="dxa" w:w="80"/>
+              <w:right w:type="dxa" w:w="120"/>
+            </w:tcMar>
+          </w:tcPr>
+          <w:p>
+            <w:pPr>
+              <w:spacing w:after="0" w:line="260"/>
+            </w:pPr>
+            <w:r>
+              <w:rPr>
+                <w:sz w:val="20"/>
+                <w:szCs w:val="20"/>
+              </w:rPr>
+              <w:t xml:space="preserve">each part exists as a subject</w:t>
+            </w:r>
+          </w:p>
+        </w:tc>
+        <w:tc>
+          <w:tcPr>
+            <w:tcW w:type="dxa" w:w="2460"/>
+            <w:tcMar>
+              <w:top w:type="dxa" w:w="80"/>
+              <w:left w:type="dxa" w:w="120"/>
+              <w:bottom w:type="dxa" w:w="80"/>
+              <w:right w:type="dxa" w:w="120"/>
+            </w:tcMar>
+          </w:tcPr>
+          <w:p>
+            <w:pPr>
+              <w:spacing w:after="0" w:line="260"/>
+            </w:pPr>
+            <w:r>
+              <w:rPr>
+                <w:sz w:val="20"/>
+                <w:szCs w:val="20"/>
+              </w:rPr>
+              <w:t xml:space="preserve">candidate patterns</w:t>
+            </w:r>
+          </w:p>
+        </w:tc>
+      </w:tr>
+      <w:tr>
+        <w:tc>
+          <w:tcPr>
+            <w:tcW w:type="dxa" w:w="1500"/>
+            <w:shd w:fill="F5F7FB" w:val="clear"/>
+            <w:tcMar>
+              <w:top w:type="dxa" w:w="80"/>
+              <w:left w:type="dxa" w:w="120"/>
+              <w:bottom w:type="dxa" w:w="80"/>
+              <w:right w:type="dxa" w:w="120"/>
+            </w:tcMar>
+          </w:tcPr>
+          <w:p>
+            <w:pPr>
+              <w:spacing w:after="0" w:line="260"/>
+            </w:pPr>
+            <w:r>
+              <w:rPr>
+                <w:sz w:val="20"/>
+                <w:szCs w:val="20"/>
+              </w:rPr>
+              <w:t xml:space="preserve">L3 decided</w:t>
+            </w:r>
+          </w:p>
+        </w:tc>
+        <w:tc>
+          <w:tcPr>
+            <w:tcW w:type="dxa" w:w="3200"/>
+            <w:shd w:fill="F5F7FB" w:val="clear"/>
+            <w:tcMar>
+              <w:top w:type="dxa" w:w="80"/>
+              <w:left w:type="dxa" w:w="120"/>
+              <w:bottom w:type="dxa" w:w="80"/>
+              <w:right w:type="dxa" w:w="120"/>
+            </w:tcMar>
+          </w:tcPr>
+          <w:p>
+            <w:pPr>
+              <w:spacing w:after="0" w:line="260"/>
+            </w:pPr>
+            <w:r>
+              <w:rPr>
+                <w:sz w:val="20"/>
+                <w:szCs w:val="20"/>
+              </w:rPr>
+              <w:t xml:space="preserve">which mechanism for each part</w:t>
+            </w:r>
+          </w:p>
+        </w:tc>
+        <w:tc>
+          <w:tcPr>
+            <w:tcW w:type="dxa" w:w="2200"/>
+            <w:shd w:fill="F5F7FB" w:val="clear"/>
+            <w:tcMar>
+              <w:top w:type="dxa" w:w="80"/>
+              <w:left w:type="dxa" w:w="120"/>
+              <w:bottom w:type="dxa" w:w="80"/>
+              <w:right w:type="dxa" w:w="120"/>
+            </w:tcMar>
+          </w:tcPr>
+          <w:p>
+            <w:pPr>
+              <w:spacing w:after="0" w:line="260"/>
+            </w:pPr>
+            <w:r>
+              <w:rPr>
+                <w:sz w:val="20"/>
+                <w:szCs w:val="20"/>
+              </w:rPr>
+              <w:t xml:space="preserve">one decision per part, alternatives recorded</w:t>
+            </w:r>
+          </w:p>
+        </w:tc>
+        <w:tc>
+          <w:tcPr>
+            <w:tcW w:type="dxa" w:w="2460"/>
+            <w:shd w:fill="F5F7FB" w:val="clear"/>
+            <w:tcMar>
+              <w:top w:type="dxa" w:w="80"/>
+              <w:left w:type="dxa" w:w="120"/>
+              <w:bottom w:type="dxa" w:w="80"/>
+              <w:right w:type="dxa" w:w="120"/>
+            </w:tcMar>
+          </w:tcPr>
+          <w:p>
+            <w:pPr>
+              <w:spacing w:after="0" w:line="260"/>
+            </w:pPr>
+            <w:r>
+              <w:rPr>
+                <w:sz w:val="20"/>
+                <w:szCs w:val="20"/>
+              </w:rPr>
+              <w:t xml:space="preserve">prior decisions and their consequences</w:t>
+            </w:r>
+          </w:p>
+        </w:tc>
+      </w:tr>
+      <w:tr>
+        <w:tc>
+          <w:tcPr>
+            <w:tcW w:type="dxa" w:w="1500"/>
+            <w:tcMar>
+              <w:top w:type="dxa" w:w="80"/>
+              <w:left w:type="dxa" w:w="120"/>
+              <w:bottom w:type="dxa" w:w="80"/>
+              <w:right w:type="dxa" w:w="120"/>
+            </w:tcMar>
+          </w:tcPr>
+          <w:p>
+            <w:pPr>
+              <w:spacing w:after="0" w:line="260"/>
+            </w:pPr>
+            <w:r>
+              <w:rPr>
+                <w:sz w:val="20"/>
+                <w:szCs w:val="20"/>
+              </w:rPr>
+              <w:t xml:space="preserve">L4 specified</w:t>
+            </w:r>
+          </w:p>
+        </w:tc>
+        <w:tc>
+          <w:tcPr>
+            <w:tcW w:type="dxa" w:w="3200"/>
+            <w:tcMar>
+              <w:top w:type="dxa" w:w="80"/>
+              <w:left w:type="dxa" w:w="120"/>
+              <w:bottom w:type="dxa" w:w="80"/>
+              <w:right w:type="dxa" w:w="120"/>
+            </w:tcMar>
+          </w:tcPr>
+          <w:p>
+            <w:pPr>
+              <w:spacing w:after="0" w:line="260"/>
+            </w:pPr>
+            <w:r>
+              <w:rPr>
+                <w:sz w:val="20"/>
+                <w:szCs w:val="20"/>
+              </w:rPr>
+              <w:t xml:space="preserve">which values and thresholds</w:t>
+            </w:r>
+          </w:p>
+        </w:tc>
+        <w:tc>
+          <w:tcPr>
+            <w:tcW w:type="dxa" w:w="2200"/>
+            <w:tcMar>
+              <w:top w:type="dxa" w:w="80"/>
+              <w:left w:type="dxa" w:w="120"/>
+              <w:bottom w:type="dxa" w:w="80"/>
+              <w:right w:type="dxa" w:w="120"/>
+            </w:tcMar>
+          </w:tcPr>
+          <w:p>
+            <w:pPr>
+              <w:spacing w:after="0" w:line="260"/>
+            </w:pPr>
+            <w:r>
+              <w:rPr>
+                <w:sz w:val="20"/>
+                <w:szCs w:val="20"/>
+              </w:rPr>
+              <w:t xml:space="preserve">parameters are recorded</w:t>
+            </w:r>
+          </w:p>
+        </w:tc>
+        <w:tc>
+          <w:tcPr>
+            <w:tcW w:type="dxa" w:w="2460"/>
+            <w:tcMar>
+              <w:top w:type="dxa" w:w="80"/>
+              <w:left w:type="dxa" w:w="120"/>
+              <w:bottom w:type="dxa" w:w="80"/>
+              <w:right w:type="dxa" w:w="120"/>
+            </w:tcMar>
+          </w:tcPr>
+          <w:p>
+            <w:pPr>
+              <w:spacing w:after="0" w:line="260"/>
+            </w:pPr>
+            <w:r>
+              <w:rPr>
+                <w:sz w:val="20"/>
+                <w:szCs w:val="20"/>
+              </w:rPr>
+              <w:t xml:space="preserve">values from previous engagements</w:t>
+            </w:r>
+          </w:p>
+        </w:tc>
+      </w:tr>
+    </w:tbl>
+    <w:p>
+      <w:pPr>
+        <w:spacing w:after="200"/>
+      </w:pPr>
+    </w:p>
+    <w:p>
+      <w:pPr>
+        <w:spacing w:after="150" w:line="300"/>
+        <w:jc w:val="both"/>
+      </w:pPr>
+      <w:r>
+        <w:rPr>
+          <w:sz w:val="22"/>
+          <w:szCs w:val="22"/>
+        </w:rPr>
+        <w:t xml:space="preserve">The level that carries the idea is L2. When an expert has just decomposed a subject, the base can say: this decomposition resembles a pattern we hold, here is how it was broken down elsewhere, and here is the section that says when not to use it. The pattern is offered as a candidate solution shape to confirm or discard, not as an answer. Problem and solution refine together, which is what happens in a good design review and almost never in a document.</w:t>
+      </w:r>
+    </w:p>
+    <w:p>
+      <w:pPr>
+        <w:spacing w:after="150" w:line="300"/>
+        <w:jc w:val="both"/>
+      </w:pPr>
+      <w:r>
+        <w:rPr>
+          <w:sz w:val="22"/>
+          <w:szCs w:val="22"/>
+        </w:rPr>
+        <w:t xml:space="preserve">This also replaces a cruder rule. A question is held back not because its subject does not exist, but because the subject is not yet ripe for it: asking which storage backs the management cluster while that subject is still being framed is the kind of question that makes people stop reading.</w:t>
       </w:r>
     </w:p>
     <w:tbl>
@@ -1183,7 +1973,7 @@
                 <w:sz w:val="22"/>
                 <w:szCs w:val="22"/>
               </w:rPr>
-              <w:t xml:space="preserve">The most useful behaviour of this system is not that it writes. It is that it refuses: it reports gaps instead of filling them, returns 'this section cannot be written honestly' instead of improvising, and flags what does not hold together.</w:t>
+              <w:t xml:space="preserve">A level advances only when a human confirms the statements that satisfy the transition. No model sets a maturity level, and no pattern is ever applied automatically.</w:t>
             </w:r>
           </w:p>
         </w:tc>
@@ -1195,7 +1985,7 @@
         <w:spacing w:after="180" w:before="380"/>
       </w:pPr>
       <w:r>
-        <w:t xml:space="preserve">6. Producing a document, second model: gap-driven elicitation</w:t>
+        <w:t xml:space="preserve">6. Seeing what is left to instruct</w:t>
       </w:r>
     </w:p>
     <w:p>
@@ -1208,7 +1998,7 @@
           <w:sz w:val="22"/>
           <w:szCs w:val="22"/>
         </w:rPr>
-        <w:t xml:space="preserve">The pipeline assumes one author who knows what to say. Real architecture work is collective: several experts hold different pieces, none holds the whole, and they share neither vocabulary nor scope. For that situation the model inverts. The system holds the goal — fill in what is missing for this engagement — and interrogates the experts. It is a chatbot in reverse: the initiative sits with the process, the knowledge with the humans.</w:t>
+        <w:t xml:space="preserve">With refinement per subject, the natural overview is not a list of open questions but a board: where each subject stands, what blocks its next step, and who owes an answer.</w:t>
       </w:r>
     </w:p>
     <w:p>
@@ -1219,7 +2009,7 @@
       <w:r>
         <w:drawing>
           <wp:inline distT="0" distB="0" distL="0" distR="0">
-            <wp:extent cx="5715000" cy="3171825"/>
+            <wp:extent cx="5715000" cy="2705100"/>
             <wp:effectExtent t="0" r="0" b="0" l="0"/>
             <wp:docPr id="1" name="" descr="" title=""/>
             <wp:cNvGraphicFramePr>
@@ -1244,7 +2034,7 @@
                   <pic:spPr bwMode="auto">
                     <a:xfrm>
                       <a:off x="0" y="0"/>
-                      <a:ext cx="5715000" cy="3171825"/>
+                      <a:ext cx="5715000" cy="2705100"/>
                     </a:xfrm>
                     <a:prstGeom prst="rect">
                       <a:avLst/>
@@ -1270,16 +2060,7 @@
           <w:sz w:val="19"/>
           <w:szCs w:val="19"/>
         </w:rPr>
-        <w:t xml:space="preserve">Figure 3 — Multi-expert contribution: framed conversation, typed statements, checks, arbitration</w:t>
-      </w:r>
-    </w:p>
-    <w:p>
-      <w:pPr>
-        <w:pStyle w:val="Heading2"/>
-        <w:spacing w:after="150" w:before="300"/>
-      </w:pPr>
-      <w:r>
-        <w:t xml:space="preserve">6.1 Statements, not prose</w:t>
+        <w:t xml:space="preserve">Figure 3 — The maturity board: what is ripe, what is stuck, and with whom</w:t>
       </w:r>
     </w:p>
     <w:p>
@@ -1292,16 +2073,7 @@
           <w:sz w:val="22"/>
           <w:szCs w:val="22"/>
         </w:rPr>
-        <w:t xml:space="preserve">The unit of contribution is not a paragraph. If several experts edit prose in parallel, we collect merge conflicts on text and, worse, semantic contradictions that nobody notices — one section assuming a mechanism another section budgets nothing for. Instead, each contribution is recorded as typed statements: a subject, a predicate from a controlled list, a value, plus the author, the confidence and the expert's own words kept verbatim. Prose is generated from the statements; contradictions become detectable by query.</w:t>
-      </w:r>
-    </w:p>
-    <w:p>
-      <w:pPr>
-        <w:pStyle w:val="Heading2"/>
-        <w:spacing w:after="150" w:before="300"/>
-      </w:pPr>
-      <w:r>
-        <w:t xml:space="preserve">6.2 The question is where the quality is</w:t>
+        <w:t xml:space="preserve">Two derived rules make it operational rather than decorative. Section readiness: a section renders as final only when every subject it depends on is decided or beyond; below that it renders provisional and names the subjects that are not ripe — which connects maturity to the status of the deliverable rather than leaving it as a management artefact. And stall detection: a subject unchanged beyond a threshold with an open question is flagged.</w:t>
       </w:r>
     </w:p>
     <w:p>
@@ -1314,7 +2086,16 @@
           <w:sz w:val="22"/>
           <w:szCs w:val="22"/>
         </w:rPr>
-        <w:t xml:space="preserve">A diffuse absence is not a question. Crystallising a gap means producing something answerable in one or two sentences by one identified person, carrying four things: why it matters and what it blocks, the canonical vocabulary to use, the shape of the expected answer, and — where the base has one — what a previous engagement answered.</w:t>
+        <w:t xml:space="preserve">In a weekly review the column that matters is not the levels. It is 'blocked by', with a name and an elapsed time. On the board above, one line needs attention this week: a subject stuck at framing for nine days because a question is unanswered. Everything else is progressing.</w:t>
+      </w:r>
+    </w:p>
+    <w:p>
+      <w:pPr>
+        <w:pStyle w:val="Heading1"/>
+        <w:spacing w:after="180" w:before="380"/>
+      </w:pPr>
+      <w:r>
+        <w:t xml:space="preserve">7. A worked example</w:t>
       </w:r>
     </w:p>
     <w:p>
@@ -1327,7 +2108,7 @@
           <w:sz w:val="22"/>
           <w:szCs w:val="22"/>
         </w:rPr>
-        <w:t xml:space="preserve">That last element is the reuse mechanism. Instead of an open question, the expert is shown a default and asked to confirm or diverge. The delta becomes the contribution. It is far cheaper cognitively, and it draws prior engagements into the current one without anyone having to go and read them.</w:t>
+        <w:t xml:space="preserve">Three architects, one contested decision, no command line: Alice, Bob and Charlie work entirely from their browser, in issues on a private repository. What follows is condensed from the reference scenario shipped with the prototype.</w:t>
       </w:r>
     </w:p>
     <w:p>
@@ -1340,18 +2121,295 @@
           <w:sz w:val="22"/>
           <w:szCs w:val="22"/>
         </w:rPr>
-        <w:t xml:space="preserve">Presenting the canonical vocabulary in the question also solves the hardest problem in this design. If one expert says 'the management cluster' and another 'the administration zone', no contradiction is ever detected because the system does not know they mean the same thing. Serving the term with the question makes the answer attach to the right node by construction — elicitation is the normalisation mechanism.</w:t>
-      </w:r>
-    </w:p>
-    <w:p>
-      <w:pPr>
-        <w:pStyle w:val="Heading2"/>
-        <w:spacing w:after="150" w:before="300"/>
-      </w:pPr>
-      <w:r>
-        <w:t xml:space="preserve">6.3 What the system checks, and what it must not decide</w:t>
-      </w:r>
-    </w:p>
+        <w:t xml:space="preserve">The system opens an issue and assigns it to a role. This is what Alice sees.</w:t>
+      </w:r>
+    </w:p>
+    <w:tbl>
+      <w:tblPr>
+        <w:tblW w:type="dxa" w:w="9360"/>
+        <w:tblBorders>
+          <w:top w:val="single" w:color="B4C4DE" w:sz="4"/>
+          <w:left w:val="single" w:color="B4C4DE" w:sz="4"/>
+          <w:bottom w:val="single" w:color="B4C4DE" w:sz="4"/>
+          <w:right w:val="single" w:color="B4C4DE" w:sz="4"/>
+          <w:insideH w:val="none"/>
+          <w:insideV w:val="none"/>
+        </w:tblBorders>
+      </w:tblPr>
+      <w:tblGrid>
+        <w:gridCol w:w="9360"/>
+      </w:tblGrid>
+      <w:tr>
+        <w:tc>
+          <w:tcPr>
+            <w:tcW w:type="dxa" w:w="9360"/>
+            <w:shd w:fill="F7F9FC" w:val="clear"/>
+            <w:tcMar>
+              <w:top w:type="dxa" w:w="130"/>
+              <w:left w:type="dxa" w:w="170"/>
+              <w:bottom w:type="dxa" w:w="130"/>
+              <w:right w:type="dxa" w:w="170"/>
+            </w:tcMar>
+          </w:tcPr>
+          <w:p>
+            <w:pPr>
+              <w:spacing w:after="140" w:line="275"/>
+            </w:pPr>
+            <w:r>
+              <w:rPr>
+                <w:rFonts w:ascii="Consolas" w:cs="Consolas" w:eastAsia="Consolas" w:hAnsi="Consolas"/>
+                <w:color w:val="5A5A5A"/>
+                <w:sz w:val="18"/>
+                <w:szCs w:val="18"/>
+              </w:rPr>
+              <w:t xml:space="preserve">[Q-0001]  role:cloud-architect · section:5.2 · blocks:2</w:t>
+            </w:r>
+          </w:p>
+          <w:p>
+            <w:pPr>
+              <w:spacing w:after="140" w:line="275"/>
+            </w:pPr>
+            <w:r>
+              <w:rPr>
+                <w:b/>
+                <w:bCs/>
+                <w:color w:val="2C2C2A"/>
+                <w:sz w:val="20"/>
+                <w:szCs w:val="20"/>
+              </w:rPr>
+              <w:t xml:space="preserve">Which storage backs the management cluster, and is it distinct from the storage of the workload clusters?</w:t>
+            </w:r>
+          </w:p>
+          <w:p>
+            <w:pPr>
+              <w:spacing w:after="60" w:line="275"/>
+            </w:pPr>
+            <w:r>
+              <w:rPr>
+                <w:b/>
+                <w:bCs/>
+                <w:color w:val="2C2C2A"/>
+                <w:sz w:val="19"/>
+                <w:szCs w:val="19"/>
+              </w:rPr>
+              <w:t xml:space="preserve">Why this matters</w:t>
+            </w:r>
+          </w:p>
+          <w:p>
+            <w:pPr>
+              <w:spacing w:after="140" w:line="275"/>
+            </w:pPr>
+            <w:r>
+              <w:rPr>
+                <w:color w:val="2C2C2A"/>
+                <w:sz w:val="20"/>
+                <w:szCs w:val="20"/>
+              </w:rPr>
+              <w:t xml:space="preserve">P-009 requires an independent failure domain for the management plane. Without a distinct backing store, section 6.3 cannot claim that the recovery chain survives an incident affecting the workloads it is meant to recover.</w:t>
+            </w:r>
+          </w:p>
+          <w:p>
+            <w:pPr>
+              <w:spacing w:after="60" w:line="275"/>
+            </w:pPr>
+            <w:r>
+              <w:rPr>
+                <w:b/>
+                <w:bCs/>
+                <w:color w:val="2C2C2A"/>
+                <w:sz w:val="19"/>
+                <w:szCs w:val="19"/>
+              </w:rPr>
+              <w:t xml:space="preserve">Please use these terms</w:t>
+            </w:r>
+          </w:p>
+          <w:p>
+            <w:pPr>
+              <w:spacing w:after="140" w:line="275"/>
+            </w:pPr>
+            <w:r>
+              <w:rPr>
+                <w:rFonts w:ascii="Consolas" w:cs="Consolas" w:eastAsia="Consolas" w:hAnsi="Consolas"/>
+                <w:color w:val="2C2C2A"/>
+                <w:sz w:val="19"/>
+                <w:szCs w:val="19"/>
+              </w:rPr>
+              <w:t xml:space="preserve">management-cluster · workload-cluster · failure-domain</w:t>
+            </w:r>
+          </w:p>
+          <w:p>
+            <w:pPr>
+              <w:spacing w:after="60" w:line="275"/>
+            </w:pPr>
+            <w:r>
+              <w:rPr>
+                <w:b/>
+                <w:bCs/>
+                <w:color w:val="2C2C2A"/>
+                <w:sz w:val="19"/>
+                <w:szCs w:val="19"/>
+              </w:rPr>
+              <w:t xml:space="preserve">Previously answered elsewhere</w:t>
+            </w:r>
+          </w:p>
+          <w:p>
+            <w:pPr>
+              <w:spacing w:after="60" w:line="275"/>
+            </w:pPr>
+            <w:r>
+              <w:rPr>
+                <w:i/>
+                <w:iCs/>
+                <w:color w:val="2C2C2A"/>
+                <w:sz w:val="20"/>
+                <w:szCs w:val="20"/>
+              </w:rPr>
+              <w:t xml:space="preserve">mcx-core-2026 → “dedicated array, not shared with workloads” — confidence: designed</w:t>
+            </w:r>
+          </w:p>
+          <w:p>
+            <w:pPr>
+              <w:spacing w:after="140" w:line="275"/>
+            </w:pPr>
+            <w:r>
+              <w:rPr>
+                <w:color w:val="2C2C2A"/>
+                <w:sz w:val="20"/>
+                <w:szCs w:val="20"/>
+              </w:rPr>
+              <w:t xml:space="preserve">Confirm this for your engagement, or tell us how it differs here.</w:t>
+            </w:r>
+          </w:p>
+          <w:p>
+            <w:pPr>
+              <w:spacing w:after="60" w:line="275"/>
+            </w:pPr>
+            <w:r>
+              <w:rPr>
+                <w:color w:val="5A5A5A"/>
+                <w:sz w:val="18"/>
+                <w:szCs w:val="18"/>
+              </w:rPr>
+              <w:t xml:space="preserve">Constrained by  P-009 · ADR-0007          What is already recorded about management-cluster · current draft of 5.2</w:t>
+            </w:r>
+          </w:p>
+        </w:tc>
+      </w:tr>
+    </w:tbl>
+    <w:p>
+      <w:pPr>
+        <w:spacing w:after="120" w:line="300"/>
+        <w:jc w:val="both"/>
+      </w:pPr>
+      <w:r>
+        <w:rPr>
+          <w:sz w:val="22"/>
+          <w:szCs w:val="22"/>
+        </w:rPr>
+        <w:t xml:space="preserve">Alice answers in her own words, and diverges: the customer already operates a tier-one array and wants a single storage contract. The system records nothing yet — it shows her what it intends to write.</w:t>
+      </w:r>
+    </w:p>
+    <w:tbl>
+      <w:tblPr>
+        <w:tblW w:type="dxa" w:w="9360"/>
+        <w:tblBorders>
+          <w:top w:val="single" w:color="B4C4DE" w:sz="4"/>
+          <w:left w:val="single" w:color="B4C4DE" w:sz="4"/>
+          <w:bottom w:val="single" w:color="B4C4DE" w:sz="4"/>
+          <w:right w:val="single" w:color="B4C4DE" w:sz="4"/>
+          <w:insideH w:val="none"/>
+          <w:insideV w:val="none"/>
+        </w:tblBorders>
+      </w:tblPr>
+      <w:tblGrid>
+        <w:gridCol w:w="9360"/>
+      </w:tblGrid>
+      <w:tr>
+        <w:tc>
+          <w:tcPr>
+            <w:tcW w:type="dxa" w:w="9360"/>
+            <w:shd w:fill="F2F7F4" w:val="clear"/>
+            <w:tcMar>
+              <w:top w:type="dxa" w:w="130"/>
+              <w:left w:type="dxa" w:w="170"/>
+              <w:bottom w:type="dxa" w:w="130"/>
+              <w:right w:type="dxa" w:w="170"/>
+            </w:tcMar>
+          </w:tcPr>
+          <w:p>
+            <w:pPr>
+              <w:spacing w:after="140" w:line="275"/>
+            </w:pPr>
+            <w:r>
+              <w:rPr>
+                <w:b/>
+                <w:bCs/>
+                <w:color w:val="2C2C2A"/>
+                <w:sz w:val="20"/>
+                <w:szCs w:val="20"/>
+              </w:rPr>
+              <w:t xml:space="preserve">Nothing is recorded yet. Confirm, correct or reject.</w:t>
+            </w:r>
+          </w:p>
+          <w:p>
+            <w:pPr>
+              <w:spacing w:after="60" w:line="275"/>
+            </w:pPr>
+            <w:r>
+              <w:rPr>
+                <w:rFonts w:ascii="Consolas" w:cs="Consolas" w:eastAsia="Consolas" w:hAnsi="Consolas"/>
+                <w:color w:val="2C2C2A"/>
+                <w:sz w:val="18"/>
+                <w:szCs w:val="18"/>
+              </w:rPr>
+              <w:t xml:space="preserve">S-0007   management-cluster · has_property · “tier-1 dual-controller NVMe SAN, dedicated LUN group”</w:t>
+            </w:r>
+          </w:p>
+          <w:p>
+            <w:pPr>
+              <w:spacing w:after="140" w:line="275"/>
+            </w:pPr>
+            <w:r>
+              <w:rPr>
+                <w:rFonts w:ascii="Consolas" w:cs="Consolas" w:eastAsia="Consolas" w:hAnsi="Consolas"/>
+                <w:color w:val="2C2C2A"/>
+                <w:sz w:val="18"/>
+                <w:szCs w:val="18"/>
+              </w:rPr>
+              <w:t xml:space="preserve">S-0008   management-cluster · has_property · “same physical array as workload-cluster — logical separation only”</w:t>
+            </w:r>
+          </w:p>
+          <w:p>
+            <w:pPr>
+              <w:spacing w:after="140" w:line="275"/>
+            </w:pPr>
+            <w:r>
+              <w:rPr>
+                <w:i/>
+                <w:iCs/>
+                <w:color w:val="2C2C2A"/>
+                <w:sz w:val="20"/>
+                <w:szCs w:val="20"/>
+              </w:rPr>
+              <w:t xml:space="preserve">Diverges from the prior answer of mcx-core-2026, which used a physically separate array.</w:t>
+            </w:r>
+          </w:p>
+          <w:p>
+            <w:pPr>
+              <w:spacing w:after="60" w:line="275"/>
+            </w:pPr>
+            <w:r>
+              <w:rPr>
+                <w:color w:val="5A5A5A"/>
+                <w:sz w:val="19"/>
+                <w:szCs w:val="19"/>
+              </w:rPr>
+              <w:t xml:space="preserve">Your words, kept as recorded: “The customer already operates a tier-1 dual-controller NVMe SAN and wants a single storage contract…”</w:t>
+            </w:r>
+          </w:p>
+        </w:tc>
+      </w:tr>
+    </w:tbl>
     <w:p>
       <w:pPr>
         <w:spacing w:after="150" w:line="300"/>
@@ -1362,9 +2420,152 @@
           <w:sz w:val="22"/>
           <w:szCs w:val="22"/>
         </w:rPr>
-        <w:t xml:space="preserve">New statements are checked against the rest: direct contradiction on the same subject and predicate, violation of an applicable principle, reliance on a superseded decision, unsupported claims, terminology drift, scope drift. These are queries over a graph, not judgements of a model.</w:t>
-      </w:r>
-    </w:p>
+        <w:t xml:space="preserve">She confirms. The checks run on the new statements and produce an advisory note: a shared physical array sits uneasily with the independent failure domain that P-009 requires. The system neither blocks nor decides — it points at the tension.</w:t>
+      </w:r>
+    </w:p>
+    <w:p>
+      <w:pPr>
+        <w:spacing w:after="120" w:line="300"/>
+        <w:jc w:val="both"/>
+      </w:pPr>
+      <w:r>
+        <w:rPr>
+          <w:sz w:val="22"/>
+          <w:szCs w:val="22"/>
+        </w:rPr>
+        <w:t xml:space="preserve">Three days later Bob, who was never asked this question, contests a statement about a subject he owns. A conflict issue opens and is assigned to Charlie.</w:t>
+      </w:r>
+    </w:p>
+    <w:tbl>
+      <w:tblPr>
+        <w:tblW w:type="dxa" w:w="9360"/>
+        <w:tblBorders>
+          <w:top w:val="single" w:color="B4C4DE" w:sz="4"/>
+          <w:left w:val="single" w:color="B4C4DE" w:sz="4"/>
+          <w:bottom w:val="single" w:color="B4C4DE" w:sz="4"/>
+          <w:right w:val="single" w:color="B4C4DE" w:sz="4"/>
+          <w:insideH w:val="none"/>
+          <w:insideV w:val="none"/>
+        </w:tblBorders>
+      </w:tblPr>
+      <w:tblGrid>
+        <w:gridCol w:w="9360"/>
+      </w:tblGrid>
+      <w:tr>
+        <w:tc>
+          <w:tcPr>
+            <w:tcW w:type="dxa" w:w="9360"/>
+            <w:shd w:fill="FBF3EC" w:val="clear"/>
+            <w:tcMar>
+              <w:top w:type="dxa" w:w="130"/>
+              <w:left w:type="dxa" w:w="170"/>
+              <w:bottom w:type="dxa" w:w="130"/>
+              <w:right w:type="dxa" w:w="170"/>
+            </w:tcMar>
+          </w:tcPr>
+          <w:p>
+            <w:pPr>
+              <w:spacing w:after="140" w:line="275"/>
+            </w:pPr>
+            <w:r>
+              <w:rPr>
+                <w:rFonts w:ascii="Consolas" w:cs="Consolas" w:eastAsia="Consolas" w:hAnsi="Consolas"/>
+                <w:color w:val="5A5A5A"/>
+                <w:sz w:val="18"/>
+                <w:szCs w:val="18"/>
+              </w:rPr>
+              <w:t xml:space="preserve">[C-0001]  contested: management-cluster · has_property</w:t>
+            </w:r>
+          </w:p>
+          <w:p>
+            <w:pPr>
+              <w:spacing w:after="60" w:line="275"/>
+            </w:pPr>
+            <w:r>
+              <w:rPr>
+                <w:rFonts w:ascii="Consolas" w:cs="Consolas" w:eastAsia="Consolas" w:hAnsi="Consolas"/>
+                <w:color w:val="2C2C2A"/>
+                <w:sz w:val="18"/>
+                <w:szCs w:val="18"/>
+              </w:rPr>
+              <w:t xml:space="preserve">S-0008   “same physical array as workload-cluster — logical separation only”</w:t>
+            </w:r>
+          </w:p>
+          <w:p>
+            <w:pPr>
+              <w:spacing w:after="100" w:line="275"/>
+            </w:pPr>
+            <w:r>
+              <w:rPr>
+                <w:rFonts w:ascii="Consolas" w:cs="Consolas" w:eastAsia="Consolas" w:hAnsi="Consolas"/>
+                <w:color w:val="5A5A5A"/>
+                <w:sz w:val="18"/>
+                <w:szCs w:val="18"/>
+              </w:rPr>
+              <w:t xml:space="preserve">         alice · cloud-architect · designed · 2026-07-24</w:t>
+            </w:r>
+          </w:p>
+          <w:p>
+            <w:pPr>
+              <w:spacing w:after="60" w:line="275"/>
+            </w:pPr>
+            <w:r>
+              <w:rPr>
+                <w:rFonts w:ascii="Consolas" w:cs="Consolas" w:eastAsia="Consolas" w:hAnsi="Consolas"/>
+                <w:color w:val="2C2C2A"/>
+                <w:sz w:val="18"/>
+                <w:szCs w:val="18"/>
+              </w:rPr>
+              <w:t xml:space="preserve">S-0011   “isolated three-node all-flash cluster, no shared fabric”</w:t>
+            </w:r>
+          </w:p>
+          <w:p>
+            <w:pPr>
+              <w:spacing w:after="140" w:line="275"/>
+            </w:pPr>
+            <w:r>
+              <w:rPr>
+                <w:rFonts w:ascii="Consolas" w:cs="Consolas" w:eastAsia="Consolas" w:hAnsi="Consolas"/>
+                <w:color w:val="5A5A5A"/>
+                <w:sz w:val="18"/>
+                <w:szCs w:val="18"/>
+              </w:rPr>
+              <w:t xml:space="preserve">         bob · storage-expert · designed · 2026-07-27</w:t>
+            </w:r>
+          </w:p>
+          <w:p>
+            <w:pPr>
+              <w:spacing w:after="140" w:line="275"/>
+            </w:pPr>
+            <w:r>
+              <w:rPr>
+                <w:i/>
+                <w:iCs/>
+                <w:color w:val="2C2C2A"/>
+                <w:sz w:val="20"/>
+                <w:szCs w:val="20"/>
+              </w:rPr>
+              <w:t xml:space="preserve">Advisory: a shared array creates a common failure mode between the management plane and the workloads it recovers. For the arbitrator, not a verdict.</w:t>
+            </w:r>
+          </w:p>
+          <w:p>
+            <w:pPr>
+              <w:spacing w:after="60" w:line="275"/>
+            </w:pPr>
+            <w:r>
+              <w:rPr>
+                <w:b/>
+                <w:bCs/>
+                <w:color w:val="2C2C2A"/>
+                <w:sz w:val="19"/>
+                <w:szCs w:val="19"/>
+              </w:rPr>
+              <w:t xml:space="preserve">Both statements remain active. Section 5.2 renders both positions until arbitration.</w:t>
+            </w:r>
+          </w:p>
+        </w:tc>
+      </w:tr>
+    </w:tbl>
     <w:p>
       <w:pPr>
         <w:spacing w:after="150" w:line="300"/>
@@ -1375,16 +2576,74 @@
           <w:sz w:val="22"/>
           <w:szCs w:val="22"/>
         </w:rPr>
-        <w:t xml:space="preserve">Where a conflict is found, neither statement is modified or withdrawn. Both remain active, a conflict is raised, and it is routed to the two authors and to the chief architect. The system surfaces; humans arbitrate. This is the same principle we apply to network remediation, turned on our own documents.</w:t>
-      </w:r>
-    </w:p>
+        <w:t xml:space="preserve">Charlie arbitrates in a comment, with a mandatory rationale: the principle is not negotiable on a mission-critical management plane, and the commercial expectation of a single storage contract goes into the risk register rather than into the design. Bob's position is kept, Alice's is superseded with the reason attached, and it stays in the history as a promotion candidate should the shared-array approach prove right elsewhere.</w:t>
+      </w:r>
+    </w:p>
+    <w:p>
+      <w:pPr>
+        <w:spacing w:after="150" w:line="300"/>
+        <w:jc w:val="both"/>
+      </w:pPr>
+      <w:r>
+        <w:rPr>
+          <w:sz w:val="22"/>
+          <w:szCs w:val="22"/>
+        </w:rPr>
+        <w:t xml:space="preserve">Section 5.2 then renders from the surviving statements — including the rejected option, which appears because arbitration recorded it, not because somebody remembered to write it down.</w:t>
+      </w:r>
+    </w:p>
+    <w:tbl>
+      <w:tblPr>
+        <w:tblW w:type="dxa" w:w="9360"/>
+        <w:tblBorders>
+          <w:top w:val="single" w:color="2E5496" w:sz="4"/>
+          <w:left w:val="single" w:color="2E5496" w:sz="14"/>
+          <w:bottom w:val="single" w:color="2E5496" w:sz="4"/>
+          <w:right w:val="single" w:color="2E5496" w:sz="4"/>
+          <w:insideH w:val="none"/>
+          <w:insideV w:val="none"/>
+        </w:tblBorders>
+      </w:tblPr>
+      <w:tblGrid>
+        <w:gridCol w:w="9360"/>
+      </w:tblGrid>
+      <w:tr>
+        <w:tc>
+          <w:tcPr>
+            <w:tcW w:type="dxa" w:w="9360"/>
+            <w:shd w:fill="EDF1F8" w:val="clear"/>
+            <w:tcMar>
+              <w:top w:type="dxa" w:w="140"/>
+              <w:left w:type="dxa" w:w="180"/>
+              <w:bottom w:type="dxa" w:w="140"/>
+              <w:right w:type="dxa" w:w="180"/>
+            </w:tcMar>
+          </w:tcPr>
+          <w:p>
+            <w:pPr>
+              <w:spacing w:after="0" w:line="290"/>
+            </w:pPr>
+            <w:r>
+              <w:rPr>
+                <w:i/>
+                <w:iCs/>
+                <w:color w:val="1F3864"/>
+                <w:sz w:val="22"/>
+                <w:szCs w:val="22"/>
+              </w:rPr>
+              <w:t xml:space="preserve">Every sentence in that section traces to a statement, an author and a date. That is the difference between a document and a record.</w:t>
+            </w:r>
+          </w:p>
+        </w:tc>
+      </w:tr>
+    </w:tbl>
     <w:p>
       <w:pPr>
         <w:pStyle w:val="Heading1"/>
         <w:spacing w:after="180" w:before="380"/>
       </w:pPr>
       <w:r>
-        <w:t xml:space="preserve">7. Where the machine sits, and where it does not</w:t>
+        <w:t xml:space="preserve">8. Under the hood</w:t>
       </w:r>
     </w:p>
     <w:p>
@@ -1397,7 +2656,7 @@
           <w:sz w:val="22"/>
           <w:szCs w:val="22"/>
         </w:rPr>
-        <w:t xml:space="preserve">Two separations make this dependable. The first is between what holds state and what reasons. A conversation with an expert unfolds over days: a question goes out on Tuesday, one expert answers Thursday, another is on leave, the chief architect arbitrates the week after. A process that must stay alive through that is broken at the first absence. So the durable process owns the state, the waiting and the audit trail; agent tasks are short, stateless and replaceable; and humans are external actors reached through a mailbox, not functions to be called and awaited.</w:t>
+        <w:t xml:space="preserve">What the expert sees is a question and, later, a proposal of what will be recorded. Everything below is the system's problem.</w:t>
       </w:r>
     </w:p>
     <w:p>
@@ -1408,7 +2667,7 @@
       <w:r>
         <w:drawing>
           <wp:inline distT="0" distB="0" distL="0" distR="0">
-            <wp:extent cx="5715000" cy="3305175"/>
+            <wp:extent cx="5715000" cy="3705225"/>
             <wp:effectExtent t="0" r="0" b="0" l="0"/>
             <wp:docPr id="1" name="" descr="" title=""/>
             <wp:cNvGraphicFramePr>
@@ -1433,6 +2692,81 @@
                   <pic:spPr bwMode="auto">
                     <a:xfrm>
                       <a:off x="0" y="0"/>
+                      <a:ext cx="5715000" cy="3705225"/>
+                    </a:xfrm>
+                    <a:prstGeom prst="rect">
+                      <a:avLst/>
+                    </a:prstGeom>
+                  </pic:spPr>
+                </pic:pic>
+              </a:graphicData>
+            </a:graphic>
+          </wp:inline>
+        </w:drawing>
+      </w:r>
+    </w:p>
+    <w:p>
+      <w:pPr>
+        <w:spacing w:after="220"/>
+        <w:jc w:val="center"/>
+      </w:pPr>
+      <w:r>
+        <w:rPr>
+          <w:i/>
+          <w:iCs/>
+          <w:color w:val="5A5A5A"/>
+          <w:sz w:val="19"/>
+          <w:szCs w:val="19"/>
+        </w:rPr>
+        <w:t xml:space="preserve">Figure 4 — One exchange, end to end: who asks, who reasons, who holds the truth</w:t>
+      </w:r>
+    </w:p>
+    <w:p>
+      <w:pPr>
+        <w:spacing w:after="150" w:line="300"/>
+        <w:jc w:val="both"/>
+      </w:pPr>
+      <w:r>
+        <w:rPr>
+          <w:sz w:val="22"/>
+          <w:szCs w:val="22"/>
+        </w:rPr>
+        <w:t xml:space="preserve">Two separations make this dependable. The first is between what holds state and what reasons. A conversation with an expert unfolds over days: a question goes out on Tuesday, one expert answers Thursday, another is on leave, the arbitration lands the week after. A process that must stay alive through that is broken at the first absence. So the durable process owns the state, the waiting and the audit trail; agent tasks are short, stateless and replaceable; and humans are external actors reached through a mailbox, not functions to be called and awaited.</w:t>
+      </w:r>
+    </w:p>
+    <w:p>
+      <w:pPr>
+        <w:spacing w:after="60" w:before="160"/>
+        <w:jc w:val="center"/>
+      </w:pPr>
+      <w:r>
+        <w:drawing>
+          <wp:inline distT="0" distB="0" distL="0" distR="0">
+            <wp:extent cx="5715000" cy="3305175"/>
+            <wp:effectExtent t="0" r="0" b="0" l="0"/>
+            <wp:docPr id="1" name="" descr="" title=""/>
+            <wp:cNvGraphicFramePr>
+              <a:graphicFrameLocks xmlns:a="http://schemas.openxmlformats.org/drawingml/2006/main" noChangeAspect="1"/>
+            </wp:cNvGraphicFramePr>
+            <a:graphic xmlns:a="http://schemas.openxmlformats.org/drawingml/2006/main">
+              <a:graphicData uri="http://schemas.openxmlformats.org/drawingml/2006/picture">
+                <pic:pic xmlns:pic="http://schemas.openxmlformats.org/drawingml/2006/picture">
+                  <pic:nvPicPr>
+                    <pic:cNvPr id="0" name="" descr=""/>
+                    <pic:cNvPicPr>
+                      <a:picLocks noChangeAspect="1" noChangeArrowheads="1"/>
+                    </pic:cNvPicPr>
+                  </pic:nvPicPr>
+                  <pic:blipFill>
+                    <a:blip r:embed="rId12" cstate="none"/>
+                    <a:srcRect/>
+                    <a:stretch>
+                      <a:fillRect/>
+                    </a:stretch>
+                  </pic:blipFill>
+                  <pic:spPr bwMode="auto">
+                    <a:xfrm>
+                      <a:off x="0" y="0"/>
                       <a:ext cx="5715000" cy="3305175"/>
                     </a:xfrm>
                     <a:prstGeom prst="rect">
@@ -1459,7 +2793,7 @@
           <w:sz w:val="19"/>
           <w:szCs w:val="19"/>
         </w:rPr>
-        <w:t xml:space="preserve">Figure 4 — Durable process, stateless agent tasks, humans as external actors</w:t>
+        <w:t xml:space="preserve">Figure 5 — Durable process, stateless agent tasks, humans as external actors</w:t>
       </w:r>
     </w:p>
     <w:p>
@@ -1468,7 +2802,7 @@
         <w:spacing w:after="150" w:before="300"/>
       </w:pPr>
       <w:r>
-        <w:t xml:space="preserve">7.1 The determinism boundary</w:t>
+        <w:t xml:space="preserve">8.1 The determinism boundary</w:t>
       </w:r>
     </w:p>
     <w:p>
@@ -1724,7 +3058,7 @@
                 <w:sz w:val="20"/>
                 <w:szCs w:val="20"/>
               </w:rPr>
-              <w:t xml:space="preserve">Same; and the result must be reproducible</w:t>
+              <w:t xml:space="preserve">Same, and the result must be reproducible</w:t>
             </w:r>
           </w:p>
         </w:tc>
@@ -1749,7 +3083,7 @@
                 <w:sz w:val="20"/>
                 <w:szCs w:val="20"/>
               </w:rPr>
-              <w:t xml:space="preserve">Phrasing a question</w:t>
+              <w:t xml:space="preserve">Advancing a maturity level</w:t>
             </w:r>
           </w:p>
         </w:tc>
@@ -1772,7 +3106,7 @@
                 <w:sz w:val="20"/>
                 <w:szCs w:val="20"/>
               </w:rPr>
-              <w:t xml:space="preserve">Model</w:t>
+              <w:t xml:space="preserve">Repository module, after human confirmation</w:t>
             </w:r>
           </w:p>
         </w:tc>
@@ -1795,7 +3129,7 @@
                 <w:sz w:val="20"/>
                 <w:szCs w:val="20"/>
               </w:rPr>
-              <w:t xml:space="preserve">This is writing, which is what it is good at</w:t>
+              <w:t xml:space="preserve">Progress is a fact about the engagement, not an impression</w:t>
             </w:r>
           </w:p>
         </w:tc>
@@ -1821,7 +3155,7 @@
                 <w:sz w:val="20"/>
                 <w:szCs w:val="20"/>
               </w:rPr>
-              <w:t xml:space="preserve">Proposing statements from an answer</w:t>
+              <w:t xml:space="preserve">Phrasing a question</w:t>
             </w:r>
           </w:p>
         </w:tc>
@@ -1845,7 +3179,7 @@
                 <w:sz w:val="20"/>
                 <w:szCs w:val="20"/>
               </w:rPr>
-              <w:t xml:space="preserve">Model, then human confirmation</w:t>
+              <w:t xml:space="preserve">Model</w:t>
             </w:r>
           </w:p>
         </w:tc>
@@ -1869,7 +3203,7 @@
                 <w:sz w:val="20"/>
                 <w:szCs w:val="20"/>
               </w:rPr>
-              <w:t xml:space="preserve">Extraction is a proposal, never a commit</w:t>
+              <w:t xml:space="preserve">This is writing, which is what it is good at</w:t>
             </w:r>
           </w:p>
         </w:tc>
@@ -1894,7 +3228,7 @@
                 <w:sz w:val="20"/>
                 <w:szCs w:val="20"/>
               </w:rPr>
-              <w:t xml:space="preserve">Residual semantic coherence</w:t>
+              <w:t xml:space="preserve">Proposing statements from an answer</w:t>
             </w:r>
           </w:p>
         </w:tc>
@@ -1917,7 +3251,7 @@
                 <w:sz w:val="20"/>
                 <w:szCs w:val="20"/>
               </w:rPr>
-              <w:t xml:space="preserve">Model, advisory only</w:t>
+              <w:t xml:space="preserve">Model, then human confirmation</w:t>
             </w:r>
           </w:p>
         </w:tc>
@@ -1940,7 +3274,7 @@
                 <w:sz w:val="20"/>
                 <w:szCs w:val="20"/>
               </w:rPr>
-              <w:t xml:space="preserve">Useful, imperfect, therefore never a gate</w:t>
+              <w:t xml:space="preserve">Extraction is a proposal, never a commit</w:t>
             </w:r>
           </w:p>
         </w:tc>
@@ -1966,7 +3300,7 @@
                 <w:sz w:val="20"/>
                 <w:szCs w:val="20"/>
               </w:rPr>
-              <w:t xml:space="preserve">Resolving a conflict</w:t>
+              <w:t xml:space="preserve">Proposing a pattern at decomposition</w:t>
             </w:r>
           </w:p>
         </w:tc>
@@ -1990,7 +3324,7 @@
                 <w:sz w:val="20"/>
                 <w:szCs w:val="20"/>
               </w:rPr>
-              <w:t xml:space="preserve">Human only</w:t>
+              <w:t xml:space="preserve">Model retrieves, human accepts or discards</w:t>
             </w:r>
           </w:p>
         </w:tc>
@@ -2014,6 +3348,151 @@
                 <w:sz w:val="20"/>
                 <w:szCs w:val="20"/>
               </w:rPr>
+              <w:t xml:space="preserve">A pattern applied automatically is dogma with a database behind it</w:t>
+            </w:r>
+          </w:p>
+        </w:tc>
+      </w:tr>
+      <w:tr>
+        <w:tc>
+          <w:tcPr>
+            <w:tcW w:type="dxa" w:w="3400"/>
+            <w:tcMar>
+              <w:top w:type="dxa" w:w="80"/>
+              <w:left w:type="dxa" w:w="120"/>
+              <w:bottom w:type="dxa" w:w="80"/>
+              <w:right w:type="dxa" w:w="120"/>
+            </w:tcMar>
+          </w:tcPr>
+          <w:p>
+            <w:pPr>
+              <w:spacing w:after="0" w:line="260"/>
+            </w:pPr>
+            <w:r>
+              <w:rPr>
+                <w:sz w:val="20"/>
+                <w:szCs w:val="20"/>
+              </w:rPr>
+              <w:t xml:space="preserve">Residual semantic coherence</w:t>
+            </w:r>
+          </w:p>
+        </w:tc>
+        <w:tc>
+          <w:tcPr>
+            <w:tcW w:type="dxa" w:w="2600"/>
+            <w:tcMar>
+              <w:top w:type="dxa" w:w="80"/>
+              <w:left w:type="dxa" w:w="120"/>
+              <w:bottom w:type="dxa" w:w="80"/>
+              <w:right w:type="dxa" w:w="120"/>
+            </w:tcMar>
+          </w:tcPr>
+          <w:p>
+            <w:pPr>
+              <w:spacing w:after="0" w:line="260"/>
+            </w:pPr>
+            <w:r>
+              <w:rPr>
+                <w:sz w:val="20"/>
+                <w:szCs w:val="20"/>
+              </w:rPr>
+              <w:t xml:space="preserve">Model, advisory only</w:t>
+            </w:r>
+          </w:p>
+        </w:tc>
+        <w:tc>
+          <w:tcPr>
+            <w:tcW w:type="dxa" w:w="3360"/>
+            <w:tcMar>
+              <w:top w:type="dxa" w:w="80"/>
+              <w:left w:type="dxa" w:w="120"/>
+              <w:bottom w:type="dxa" w:w="80"/>
+              <w:right w:type="dxa" w:w="120"/>
+            </w:tcMar>
+          </w:tcPr>
+          <w:p>
+            <w:pPr>
+              <w:spacing w:after="0" w:line="260"/>
+            </w:pPr>
+            <w:r>
+              <w:rPr>
+                <w:sz w:val="20"/>
+                <w:szCs w:val="20"/>
+              </w:rPr>
+              <w:t xml:space="preserve">Useful, imperfect, therefore never a gate</w:t>
+            </w:r>
+          </w:p>
+        </w:tc>
+      </w:tr>
+      <w:tr>
+        <w:tc>
+          <w:tcPr>
+            <w:tcW w:type="dxa" w:w="3400"/>
+            <w:shd w:fill="F5F7FB" w:val="clear"/>
+            <w:tcMar>
+              <w:top w:type="dxa" w:w="80"/>
+              <w:left w:type="dxa" w:w="120"/>
+              <w:bottom w:type="dxa" w:w="80"/>
+              <w:right w:type="dxa" w:w="120"/>
+            </w:tcMar>
+          </w:tcPr>
+          <w:p>
+            <w:pPr>
+              <w:spacing w:after="0" w:line="260"/>
+            </w:pPr>
+            <w:r>
+              <w:rPr>
+                <w:sz w:val="20"/>
+                <w:szCs w:val="20"/>
+              </w:rPr>
+              <w:t xml:space="preserve">Resolving a conflict</w:t>
+            </w:r>
+          </w:p>
+        </w:tc>
+        <w:tc>
+          <w:tcPr>
+            <w:tcW w:type="dxa" w:w="2600"/>
+            <w:shd w:fill="F5F7FB" w:val="clear"/>
+            <w:tcMar>
+              <w:top w:type="dxa" w:w="80"/>
+              <w:left w:type="dxa" w:w="120"/>
+              <w:bottom w:type="dxa" w:w="80"/>
+              <w:right w:type="dxa" w:w="120"/>
+            </w:tcMar>
+          </w:tcPr>
+          <w:p>
+            <w:pPr>
+              <w:spacing w:after="0" w:line="260"/>
+            </w:pPr>
+            <w:r>
+              <w:rPr>
+                <w:sz w:val="20"/>
+                <w:szCs w:val="20"/>
+              </w:rPr>
+              <w:t xml:space="preserve">Human only</w:t>
+            </w:r>
+          </w:p>
+        </w:tc>
+        <w:tc>
+          <w:tcPr>
+            <w:tcW w:type="dxa" w:w="3360"/>
+            <w:shd w:fill="F5F7FB" w:val="clear"/>
+            <w:tcMar>
+              <w:top w:type="dxa" w:w="80"/>
+              <w:left w:type="dxa" w:w="120"/>
+              <w:bottom w:type="dxa" w:w="80"/>
+              <w:right w:type="dxa" w:w="120"/>
+            </w:tcMar>
+          </w:tcPr>
+          <w:p>
+            <w:pPr>
+              <w:spacing w:after="0" w:line="260"/>
+            </w:pPr>
+            <w:r>
+              <w:rPr>
+                <w:sz w:val="20"/>
+                <w:szCs w:val="20"/>
+              </w:rPr>
               <w:t xml:space="preserve">Accountability cannot be delegated to a probabilistic component</w:t>
             </w:r>
           </w:p>
@@ -2035,7 +3514,7 @@
           <w:sz w:val="22"/>
           <w:szCs w:val="22"/>
         </w:rPr>
-        <w:t xml:space="preserve">One rule follows and admits no exception: a model never writes to the base. It proposes; a human commits. Applied to elicitation this means no statement is recorded without the contributor being shown the extraction and confirming it, with their original words kept alongside so they can say 'that is not what I meant' and prove it.</w:t>
+        <w:t xml:space="preserve">One rule follows and admits no exception: a model never writes to the base. It proposes; a human commits, and the commitment is recorded with a name against it.</w:t>
       </w:r>
     </w:p>
     <w:p>
@@ -2044,7 +3523,162 @@
         <w:spacing w:after="180" w:before="380"/>
       </w:pPr>
       <w:r>
-        <w:t xml:space="preserve">8. The working principles</w:t>
+        <w:t xml:space="preserve">9. How the base grows</w:t>
+      </w:r>
+    </w:p>
+    <w:p>
+      <w:pPr>
+        <w:spacing w:after="150" w:line="300"/>
+        <w:jc w:val="both"/>
+      </w:pPr>
+      <w:r>
+        <w:rPr>
+          <w:sz w:val="22"/>
+          <w:szCs w:val="22"/>
+        </w:rPr>
+        <w:t xml:space="preserve">The honest answer to what you get out of this depends entirely on whether you are first or third. Going first is expensive: everything is written from scratch, nothing is offered as a default, and the effort model is a guess because it has no actuals behind it. That cost is real and there is no point pretending otherwise.</w:t>
+      </w:r>
+    </w:p>
+    <w:p>
+      <w:pPr>
+        <w:spacing w:after="60" w:before="160"/>
+        <w:jc w:val="center"/>
+      </w:pPr>
+      <w:r>
+        <w:drawing>
+          <wp:inline distT="0" distB="0" distL="0" distR="0">
+            <wp:extent cx="5715000" cy="3124200"/>
+            <wp:effectExtent t="0" r="0" b="0" l="0"/>
+            <wp:docPr id="1" name="" descr="" title=""/>
+            <wp:cNvGraphicFramePr>
+              <a:graphicFrameLocks xmlns:a="http://schemas.openxmlformats.org/drawingml/2006/main" noChangeAspect="1"/>
+            </wp:cNvGraphicFramePr>
+            <a:graphic xmlns:a="http://schemas.openxmlformats.org/drawingml/2006/main">
+              <a:graphicData uri="http://schemas.openxmlformats.org/drawingml/2006/picture">
+                <pic:pic xmlns:pic="http://schemas.openxmlformats.org/drawingml/2006/picture">
+                  <pic:nvPicPr>
+                    <pic:cNvPr id="0" name="" descr=""/>
+                    <pic:cNvPicPr>
+                      <a:picLocks noChangeAspect="1" noChangeArrowheads="1"/>
+                    </pic:cNvPicPr>
+                  </pic:nvPicPr>
+                  <pic:blipFill>
+                    <a:blip r:embed="rId13" cstate="none"/>
+                    <a:srcRect/>
+                    <a:stretch>
+                      <a:fillRect/>
+                    </a:stretch>
+                  </pic:blipFill>
+                  <pic:spPr bwMode="auto">
+                    <a:xfrm>
+                      <a:off x="0" y="0"/>
+                      <a:ext cx="5715000" cy="3124200"/>
+                    </a:xfrm>
+                    <a:prstGeom prst="rect">
+                      <a:avLst/>
+                    </a:prstGeom>
+                  </pic:spPr>
+                </pic:pic>
+              </a:graphicData>
+            </a:graphic>
+          </wp:inline>
+        </w:drawing>
+      </w:r>
+    </w:p>
+    <w:p>
+      <w:pPr>
+        <w:spacing w:after="220"/>
+        <w:jc w:val="center"/>
+      </w:pPr>
+      <w:r>
+        <w:rPr>
+          <w:i/>
+          <w:iCs/>
+          <w:color w:val="5A5A5A"/>
+          <w:sz w:val="19"/>
+          <w:szCs w:val="19"/>
+        </w:rPr>
+        <w:t xml:space="preserve">Figure 6 — The composition of an engagement's work, and what the base gains from it</w:t>
+      </w:r>
+    </w:p>
+    <w:p>
+      <w:pPr>
+        <w:spacing w:after="150" w:line="300"/>
+        <w:jc w:val="both"/>
+      </w:pPr>
+      <w:r>
+        <w:rPr>
+          <w:sz w:val="22"/>
+          <w:szCs w:val="22"/>
+        </w:rPr>
+        <w:t xml:space="preserve">From the second engagement the shape changes. Questions arrive pre-filled with what was answered before, so the architect confirms or diverges rather than composing from nothing, and only the divergence has to be thought about. The effort model receives its first actuals, which is the precise moment it stops being an opinion. By the third, risks can be argued from evidence rather than instinct: this one materialised twice out of three, that one never did.</w:t>
+      </w:r>
+    </w:p>
+    <w:tbl>
+      <w:tblPr>
+        <w:tblW w:type="dxa" w:w="9360"/>
+        <w:tblBorders>
+          <w:top w:val="single" w:color="2E5496" w:sz="4"/>
+          <w:left w:val="single" w:color="2E5496" w:sz="14"/>
+          <w:bottom w:val="single" w:color="2E5496" w:sz="4"/>
+          <w:right w:val="single" w:color="2E5496" w:sz="4"/>
+          <w:insideH w:val="none"/>
+          <w:insideV w:val="none"/>
+        </w:tblBorders>
+      </w:tblPr>
+      <w:tblGrid>
+        <w:gridCol w:w="9360"/>
+      </w:tblGrid>
+      <w:tr>
+        <w:tc>
+          <w:tcPr>
+            <w:tcW w:type="dxa" w:w="9360"/>
+            <w:shd w:fill="EDF1F8" w:val="clear"/>
+            <w:tcMar>
+              <w:top w:type="dxa" w:w="140"/>
+              <w:left w:type="dxa" w:w="180"/>
+              <w:bottom w:type="dxa" w:w="140"/>
+              <w:right w:type="dxa" w:w="180"/>
+            </w:tcMar>
+          </w:tcPr>
+          <w:p>
+            <w:pPr>
+              <w:spacing w:after="0" w:line="290"/>
+            </w:pPr>
+            <w:r>
+              <w:rPr>
+                <w:i/>
+                <w:iCs/>
+                <w:color w:val="1F3864"/>
+                <w:sz w:val="22"/>
+                <w:szCs w:val="22"/>
+              </w:rPr>
+              <w:t xml:space="preserve">The reusable core grows slowly and on purpose — promotion requires a second occurrence on a different engagement. The evidence grows with every engagement. A small core with accumulating evidence is the whole bet; a large core nobody reads is the failure mode.</w:t>
+            </w:r>
+          </w:p>
+        </w:tc>
+      </w:tr>
+    </w:tbl>
+    <w:p>
+      <w:pPr>
+        <w:spacing w:after="150" w:line="300"/>
+        <w:jc w:val="both"/>
+      </w:pPr>
+      <w:r>
+        <w:rPr>
+          <w:sz w:val="22"/>
+          <w:szCs w:val="22"/>
+        </w:rPr>
+        <w:t xml:space="preserve">One caveat, in keeping with what this note preaches about confidence. The first column is observed: it is the engagement from which the current 45 assets came. The second and third are an expected shape, not a measurement. We will know whether the curve behaves like that after the second engagement, and the harvest is what will tell us.</w:t>
+      </w:r>
+    </w:p>
+    <w:p>
+      <w:pPr>
+        <w:pStyle w:val="Heading1"/>
+        <w:spacing w:after="180" w:before="380"/>
+      </w:pPr>
+      <w:r>
+        <w:t xml:space="preserve">10. The working principles</w:t>
       </w:r>
     </w:p>
     <w:p>
@@ -2154,14 +3788,14 @@
           <w:sz w:val="22"/>
           <w:szCs w:val="22"/>
         </w:rPr>
-        <w:t xml:space="preserve">The system surfaces, humans arbitrate — </w:t>
-      </w:r>
-      <w:r>
-        <w:rPr>
-          <w:sz w:val="22"/>
-          <w:szCs w:val="22"/>
-        </w:rPr>
-        <w:t xml:space="preserve">conflicts, gaps and inconsistencies are raised, never resolved automatically.</w:t>
+        <w:t xml:space="preserve">Subjects are refined coarse to fine — </w:t>
+      </w:r>
+      <w:r>
+        <w:rPr>
+          <w:sz w:val="22"/>
+          <w:szCs w:val="22"/>
+        </w:rPr>
+        <w:t xml:space="preserve">a new subject is framed, then decomposed, then decided, then specified, each at its own pace and with the base offering patterns at the point of decomposition.</w:t>
       </w:r>
     </w:p>
     <w:p>
@@ -2180,14 +3814,14 @@
           <w:sz w:val="22"/>
           <w:szCs w:val="22"/>
         </w:rPr>
-        <w:t xml:space="preserve">The model proposes, a human commits — </w:t>
-      </w:r>
-      <w:r>
-        <w:rPr>
-          <w:sz w:val="22"/>
-          <w:szCs w:val="22"/>
-        </w:rPr>
-        <w:t xml:space="preserve">extraction, drafting and detection are proposals; commitment is a human act, recorded.</w:t>
+        <w:t xml:space="preserve">The system surfaces, humans arbitrate — </w:t>
+      </w:r>
+      <w:r>
+        <w:rPr>
+          <w:sz w:val="22"/>
+          <w:szCs w:val="22"/>
+        </w:rPr>
+        <w:t xml:space="preserve">conflicts, gaps and inconsistencies are raised, never resolved automatically.</w:t>
       </w:r>
     </w:p>
     <w:p>
@@ -2206,14 +3840,14 @@
           <w:sz w:val="22"/>
           <w:szCs w:val="22"/>
         </w:rPr>
-        <w:t xml:space="preserve">Determinism where it matters, generation where it helps — </w:t>
-      </w:r>
-      <w:r>
-        <w:rPr>
-          <w:sz w:val="22"/>
-          <w:szCs w:val="22"/>
-        </w:rPr>
-        <w:t xml:space="preserve">correctness by query, writing by model. Never the reverse.</w:t>
+        <w:t xml:space="preserve">The model proposes, a human commits — </w:t>
+      </w:r>
+      <w:r>
+        <w:rPr>
+          <w:sz w:val="22"/>
+          <w:szCs w:val="22"/>
+        </w:rPr>
+        <w:t xml:space="preserve">extraction, drafting, detection and pattern retrieval are proposals; commitment is a human act, recorded.</w:t>
       </w:r>
     </w:p>
     <w:p>
@@ -2232,14 +3866,14 @@
           <w:sz w:val="22"/>
           <w:szCs w:val="22"/>
         </w:rPr>
-        <w:t xml:space="preserve">Ask, do not wait to be told — </w:t>
-      </w:r>
-      <w:r>
-        <w:rPr>
-          <w:sz w:val="22"/>
-          <w:szCs w:val="22"/>
-        </w:rPr>
-        <w:t xml:space="preserve">the system knows what is missing and goes to find it, rather than waiting for contributions that never come.</w:t>
+        <w:t xml:space="preserve">Determinism where it matters, generation where it helps — </w:t>
+      </w:r>
+      <w:r>
+        <w:rPr>
+          <w:sz w:val="22"/>
+          <w:szCs w:val="22"/>
+        </w:rPr>
+        <w:t xml:space="preserve">correctness by query, writing by model. Never the reverse.</w:t>
       </w:r>
     </w:p>
     <w:p>
@@ -2258,6 +3892,32 @@
           <w:sz w:val="22"/>
           <w:szCs w:val="22"/>
         </w:rPr>
+        <w:t xml:space="preserve">Ask, do not wait to be told — </w:t>
+      </w:r>
+      <w:r>
+        <w:rPr>
+          <w:sz w:val="22"/>
+          <w:szCs w:val="22"/>
+        </w:rPr>
+        <w:t xml:space="preserve">the system knows what is missing and goes to find it, rather than waiting for contributions that never come.</w:t>
+      </w:r>
+    </w:p>
+    <w:p>
+      <w:pPr>
+        <w:pStyle w:val="ListParagraph"/>
+        <w:numPr>
+          <w:ilvl w:val="0"/>
+          <w:numId w:val="2"/>
+        </w:numPr>
+        <w:spacing w:after="100" w:line="300"/>
+      </w:pPr>
+      <w:r>
+        <w:rPr>
+          <w:b/>
+          <w:bCs/>
+          <w:sz w:val="22"/>
+          <w:szCs w:val="22"/>
+        </w:rPr>
         <w:t xml:space="preserve">Harvest, or it is an archive — </w:t>
       </w:r>
       <w:r>
@@ -2274,7 +3934,7 @@
         <w:spacing w:after="180" w:before="380"/>
       </w:pPr>
       <w:r>
-        <w:t xml:space="preserve">9. Roles</w:t>
+        <w:t xml:space="preserve">11. Roles and state of play</w:t>
       </w:r>
     </w:p>
     <w:tbl>
@@ -2491,7 +4151,7 @@
                 <w:sz w:val="20"/>
                 <w:szCs w:val="20"/>
               </w:rPr>
-              <w:t xml:space="preserve">Arbitrates conflicts, accepts statements into the document, decides deferrals, owns the claims register and therefore the level of promise, signs the harvest</w:t>
+              <w:t xml:space="preserve">Arbitrates conflicts, accepts statements, decides deferrals, owns the claims register and therefore the level of promise, signs the harvest</w:t>
             </w:r>
           </w:p>
         </w:tc>
@@ -2597,7 +4257,7 @@
     </w:tbl>
     <w:p>
       <w:pPr>
-        <w:spacing w:after="200"/>
+        <w:spacing w:after="160"/>
       </w:pPr>
     </w:p>
     <w:p>
@@ -2610,7 +4270,776 @@
           <w:sz w:val="22"/>
           <w:szCs w:val="22"/>
         </w:rPr>
-        <w:t xml:space="preserve">One caution about the chief architect role, because the drift is predictable. They must not answer the questions on the experts' behalf. They know the subject, they are faster, and doing so quietly converts a collective instrument back into a single-author document with extra steps.</w:t>
+        <w:t xml:space="preserve">One caution about the chief architect role, because the drift is predictable: they must not answer the questions on the experts' behalf. They know the subject, they are faster, and doing so quietly converts a collective instrument back into a single-author document with extra steps.</w:t>
+      </w:r>
+    </w:p>
+    <w:p>
+      <w:pPr>
+        <w:pStyle w:val="Heading2"/>
+        <w:spacing w:after="150" w:before="300"/>
+      </w:pPr>
+      <w:r>
+        <w:t xml:space="preserve">11.1 What exists today</w:t>
+      </w:r>
+    </w:p>
+    <w:tbl>
+      <w:tblPr>
+        <w:tblW w:type="dxa" w:w="9360"/>
+        <w:tblBorders>
+          <w:top w:val="single" w:color="auto" w:sz="4"/>
+          <w:left w:val="single" w:color="auto" w:sz="4"/>
+          <w:bottom w:val="single" w:color="auto" w:sz="4"/>
+          <w:right w:val="single" w:color="auto" w:sz="4"/>
+          <w:insideH w:val="single" w:color="auto" w:sz="4"/>
+          <w:insideV w:val="single" w:color="auto" w:sz="4"/>
+        </w:tblBorders>
+      </w:tblPr>
+      <w:tblGrid>
+        <w:gridCol w:w="2900"/>
+        <w:gridCol w:w="1700"/>
+        <w:gridCol w:w="4760"/>
+      </w:tblGrid>
+      <w:tr>
+        <w:trPr>
+          <w:tblHeader/>
+        </w:trPr>
+        <w:tc>
+          <w:tcPr>
+            <w:tcW w:type="dxa" w:w="2900"/>
+            <w:shd w:fill="DDE5F2" w:val="clear"/>
+            <w:tcMar>
+              <w:top w:type="dxa" w:w="80"/>
+              <w:left w:type="dxa" w:w="120"/>
+              <w:bottom w:type="dxa" w:w="80"/>
+              <w:right w:type="dxa" w:w="120"/>
+            </w:tcMar>
+          </w:tcPr>
+          <w:p>
+            <w:pPr>
+              <w:spacing w:after="0" w:line="260"/>
+            </w:pPr>
+            <w:r>
+              <w:rPr>
+                <w:b/>
+                <w:bCs/>
+                <w:sz w:val="20"/>
+                <w:szCs w:val="20"/>
+              </w:rPr>
+              <w:t xml:space="preserve">Component</w:t>
+            </w:r>
+          </w:p>
+        </w:tc>
+        <w:tc>
+          <w:tcPr>
+            <w:tcW w:type="dxa" w:w="1700"/>
+            <w:shd w:fill="DDE5F2" w:val="clear"/>
+            <w:tcMar>
+              <w:top w:type="dxa" w:w="80"/>
+              <w:left w:type="dxa" w:w="120"/>
+              <w:bottom w:type="dxa" w:w="80"/>
+              <w:right w:type="dxa" w:w="120"/>
+            </w:tcMar>
+          </w:tcPr>
+          <w:p>
+            <w:pPr>
+              <w:spacing w:after="0" w:line="260"/>
+            </w:pPr>
+            <w:r>
+              <w:rPr>
+                <w:b/>
+                <w:bCs/>
+                <w:sz w:val="20"/>
+                <w:szCs w:val="20"/>
+              </w:rPr>
+              <w:t xml:space="preserve">State</w:t>
+            </w:r>
+          </w:p>
+        </w:tc>
+        <w:tc>
+          <w:tcPr>
+            <w:tcW w:type="dxa" w:w="4760"/>
+            <w:shd w:fill="DDE5F2" w:val="clear"/>
+            <w:tcMar>
+              <w:top w:type="dxa" w:w="80"/>
+              <w:left w:type="dxa" w:w="120"/>
+              <w:bottom w:type="dxa" w:w="80"/>
+              <w:right w:type="dxa" w:w="120"/>
+            </w:tcMar>
+          </w:tcPr>
+          <w:p>
+            <w:pPr>
+              <w:spacing w:after="0" w:line="260"/>
+            </w:pPr>
+            <w:r>
+              <w:rPr>
+                <w:b/>
+                <w:bCs/>
+                <w:sz w:val="20"/>
+                <w:szCs w:val="20"/>
+              </w:rPr>
+              <w:t xml:space="preserve">What you can do with it today</w:t>
+            </w:r>
+          </w:p>
+        </w:tc>
+      </w:tr>
+      <w:tr>
+        <w:tc>
+          <w:tcPr>
+            <w:tcW w:type="dxa" w:w="2900"/>
+            <w:tcMar>
+              <w:top w:type="dxa" w:w="80"/>
+              <w:left w:type="dxa" w:w="120"/>
+              <w:bottom w:type="dxa" w:w="80"/>
+              <w:right w:type="dxa" w:w="120"/>
+            </w:tcMar>
+          </w:tcPr>
+          <w:p>
+            <w:pPr>
+              <w:spacing w:after="0" w:line="260"/>
+            </w:pPr>
+            <w:r>
+              <w:rPr>
+                <w:sz w:val="20"/>
+                <w:szCs w:val="20"/>
+              </w:rPr>
+              <w:t xml:space="preserve">Knowledge base</w:t>
+            </w:r>
+          </w:p>
+        </w:tc>
+        <w:tc>
+          <w:tcPr>
+            <w:tcW w:type="dxa" w:w="1700"/>
+            <w:tcMar>
+              <w:top w:type="dxa" w:w="80"/>
+              <w:left w:type="dxa" w:w="120"/>
+              <w:bottom w:type="dxa" w:w="80"/>
+              <w:right w:type="dxa" w:w="120"/>
+            </w:tcMar>
+          </w:tcPr>
+          <w:p>
+            <w:pPr>
+              <w:spacing w:after="0" w:line="260"/>
+            </w:pPr>
+            <w:r>
+              <w:rPr>
+                <w:sz w:val="20"/>
+                <w:szCs w:val="20"/>
+              </w:rPr>
+              <w:t xml:space="preserve">In service</w:t>
+            </w:r>
+          </w:p>
+        </w:tc>
+        <w:tc>
+          <w:tcPr>
+            <w:tcW w:type="dxa" w:w="4760"/>
+            <w:tcMar>
+              <w:top w:type="dxa" w:w="80"/>
+              <w:left w:type="dxa" w:w="120"/>
+              <w:bottom w:type="dxa" w:w="80"/>
+              <w:right w:type="dxa" w:w="120"/>
+            </w:tcMar>
+          </w:tcPr>
+          <w:p>
+            <w:pPr>
+              <w:spacing w:after="0" w:line="260"/>
+            </w:pPr>
+            <w:r>
+              <w:rPr>
+                <w:sz w:val="20"/>
+                <w:szCs w:val="20"/>
+              </w:rPr>
+              <w:t xml:space="preserve">45 typed assets validated automatically on every change</w:t>
+            </w:r>
+          </w:p>
+        </w:tc>
+      </w:tr>
+      <w:tr>
+        <w:tc>
+          <w:tcPr>
+            <w:tcW w:type="dxa" w:w="2900"/>
+            <w:shd w:fill="F5F7FB" w:val="clear"/>
+            <w:tcMar>
+              <w:top w:type="dxa" w:w="80"/>
+              <w:left w:type="dxa" w:w="120"/>
+              <w:bottom w:type="dxa" w:w="80"/>
+              <w:right w:type="dxa" w:w="120"/>
+            </w:tcMar>
+          </w:tcPr>
+          <w:p>
+            <w:pPr>
+              <w:spacing w:after="0" w:line="260"/>
+            </w:pPr>
+            <w:r>
+              <w:rPr>
+                <w:sz w:val="20"/>
+                <w:szCs w:val="20"/>
+              </w:rPr>
+              <w:t xml:space="preserve">Knowledge server</w:t>
+            </w:r>
+          </w:p>
+        </w:tc>
+        <w:tc>
+          <w:tcPr>
+            <w:tcW w:type="dxa" w:w="1700"/>
+            <w:shd w:fill="F5F7FB" w:val="clear"/>
+            <w:tcMar>
+              <w:top w:type="dxa" w:w="80"/>
+              <w:left w:type="dxa" w:w="120"/>
+              <w:bottom w:type="dxa" w:w="80"/>
+              <w:right w:type="dxa" w:w="120"/>
+            </w:tcMar>
+          </w:tcPr>
+          <w:p>
+            <w:pPr>
+              <w:spacing w:after="0" w:line="260"/>
+            </w:pPr>
+            <w:r>
+              <w:rPr>
+                <w:sz w:val="20"/>
+                <w:szCs w:val="20"/>
+              </w:rPr>
+              <w:t xml:space="preserve">In service</w:t>
+            </w:r>
+          </w:p>
+        </w:tc>
+        <w:tc>
+          <w:tcPr>
+            <w:tcW w:type="dxa" w:w="4760"/>
+            <w:shd w:fill="F5F7FB" w:val="clear"/>
+            <w:tcMar>
+              <w:top w:type="dxa" w:w="80"/>
+              <w:left w:type="dxa" w:w="120"/>
+              <w:bottom w:type="dxa" w:w="80"/>
+              <w:right w:type="dxa" w:w="120"/>
+            </w:tcMar>
+          </w:tcPr>
+          <w:p>
+            <w:pPr>
+              <w:spacing w:after="0" w:line="260"/>
+            </w:pPr>
+            <w:r>
+              <w:rPr>
+                <w:sz w:val="20"/>
+                <w:szCs w:val="20"/>
+              </w:rPr>
+              <w:t xml:space="preserve">Read tools over the base, filterable, returning whole assets with their confidence</w:t>
+            </w:r>
+          </w:p>
+        </w:tc>
+      </w:tr>
+      <w:tr>
+        <w:tc>
+          <w:tcPr>
+            <w:tcW w:type="dxa" w:w="2900"/>
+            <w:tcMar>
+              <w:top w:type="dxa" w:w="80"/>
+              <w:left w:type="dxa" w:w="120"/>
+              <w:bottom w:type="dxa" w:w="80"/>
+              <w:right w:type="dxa" w:w="120"/>
+            </w:tcMar>
+          </w:tcPr>
+          <w:p>
+            <w:pPr>
+              <w:spacing w:after="0" w:line="260"/>
+            </w:pPr>
+            <w:r>
+              <w:rPr>
+                <w:sz w:val="20"/>
+                <w:szCs w:val="20"/>
+              </w:rPr>
+              <w:t xml:space="preserve">Authoring pipeline</w:t>
+            </w:r>
+          </w:p>
+        </w:tc>
+        <w:tc>
+          <w:tcPr>
+            <w:tcW w:type="dxa" w:w="1700"/>
+            <w:tcMar>
+              <w:top w:type="dxa" w:w="80"/>
+              <w:left w:type="dxa" w:w="120"/>
+              <w:bottom w:type="dxa" w:w="80"/>
+              <w:right w:type="dxa" w:w="120"/>
+            </w:tcMar>
+          </w:tcPr>
+          <w:p>
+            <w:pPr>
+              <w:spacing w:after="0" w:line="260"/>
+            </w:pPr>
+            <w:r>
+              <w:rPr>
+                <w:sz w:val="20"/>
+                <w:szCs w:val="20"/>
+              </w:rPr>
+              <w:t xml:space="preserve">In service</w:t>
+            </w:r>
+          </w:p>
+        </w:tc>
+        <w:tc>
+          <w:tcPr>
+            <w:tcW w:type="dxa" w:w="4760"/>
+            <w:tcMar>
+              <w:top w:type="dxa" w:w="80"/>
+              <w:left w:type="dxa" w:w="120"/>
+              <w:bottom w:type="dxa" w:w="80"/>
+              <w:right w:type="dxa" w:w="120"/>
+            </w:tcMar>
+          </w:tcPr>
+          <w:p>
+            <w:pPr>
+              <w:spacing w:after="0" w:line="260"/>
+            </w:pPr>
+            <w:r>
+              <w:rPr>
+                <w:sz w:val="20"/>
+                <w:szCs w:val="20"/>
+              </w:rPr>
+              <w:t xml:space="preserve">Produce a document from the base plus a brief, in four passes with a human gate between each</w:t>
+            </w:r>
+          </w:p>
+        </w:tc>
+      </w:tr>
+      <w:tr>
+        <w:tc>
+          <w:tcPr>
+            <w:tcW w:type="dxa" w:w="2900"/>
+            <w:shd w:fill="F5F7FB" w:val="clear"/>
+            <w:tcMar>
+              <w:top w:type="dxa" w:w="80"/>
+              <w:left w:type="dxa" w:w="120"/>
+              <w:bottom w:type="dxa" w:w="80"/>
+              <w:right w:type="dxa" w:w="120"/>
+            </w:tcMar>
+          </w:tcPr>
+          <w:p>
+            <w:pPr>
+              <w:spacing w:after="0" w:line="260"/>
+            </w:pPr>
+            <w:r>
+              <w:rPr>
+                <w:sz w:val="20"/>
+                <w:szCs w:val="20"/>
+              </w:rPr>
+              <w:t xml:space="preserve">Elicitation prototype</w:t>
+            </w:r>
+          </w:p>
+        </w:tc>
+        <w:tc>
+          <w:tcPr>
+            <w:tcW w:type="dxa" w:w="1700"/>
+            <w:shd w:fill="F5F7FB" w:val="clear"/>
+            <w:tcMar>
+              <w:top w:type="dxa" w:w="80"/>
+              <w:left w:type="dxa" w:w="120"/>
+              <w:bottom w:type="dxa" w:w="80"/>
+              <w:right w:type="dxa" w:w="120"/>
+            </w:tcMar>
+          </w:tcPr>
+          <w:p>
+            <w:pPr>
+              <w:spacing w:after="0" w:line="260"/>
+            </w:pPr>
+            <w:r>
+              <w:rPr>
+                <w:sz w:val="20"/>
+                <w:szCs w:val="20"/>
+              </w:rPr>
+              <w:t xml:space="preserve">Implemented, being hardened</w:t>
+            </w:r>
+          </w:p>
+        </w:tc>
+        <w:tc>
+          <w:tcPr>
+            <w:tcW w:type="dxa" w:w="4760"/>
+            <w:shd w:fill="F5F7FB" w:val="clear"/>
+            <w:tcMar>
+              <w:top w:type="dxa" w:w="80"/>
+              <w:left w:type="dxa" w:w="120"/>
+              <w:bottom w:type="dxa" w:w="80"/>
+              <w:right w:type="dxa" w:w="120"/>
+            </w:tcMar>
+          </w:tcPr>
+          <w:p>
+            <w:pPr>
+              <w:spacing w:after="0" w:line="260"/>
+            </w:pPr>
+            <w:r>
+              <w:rPr>
+                <w:sz w:val="20"/>
+                <w:szCs w:val="20"/>
+              </w:rPr>
+              <w:t xml:space="preserve">Gap detection, framed questions, confirmation before recording, declared and detected conflicts, arbitration, assembly</w:t>
+            </w:r>
+          </w:p>
+        </w:tc>
+      </w:tr>
+      <w:tr>
+        <w:tc>
+          <w:tcPr>
+            <w:tcW w:type="dxa" w:w="2900"/>
+            <w:tcMar>
+              <w:top w:type="dxa" w:w="80"/>
+              <w:left w:type="dxa" w:w="120"/>
+              <w:bottom w:type="dxa" w:w="80"/>
+              <w:right w:type="dxa" w:w="120"/>
+            </w:tcMar>
+          </w:tcPr>
+          <w:p>
+            <w:pPr>
+              <w:spacing w:after="0" w:line="260"/>
+            </w:pPr>
+            <w:r>
+              <w:rPr>
+                <w:sz w:val="20"/>
+                <w:szCs w:val="20"/>
+              </w:rPr>
+              <w:t xml:space="preserve">Acceptance suite</w:t>
+            </w:r>
+          </w:p>
+        </w:tc>
+        <w:tc>
+          <w:tcPr>
+            <w:tcW w:type="dxa" w:w="1700"/>
+            <w:tcMar>
+              <w:top w:type="dxa" w:w="80"/>
+              <w:left w:type="dxa" w:w="120"/>
+              <w:bottom w:type="dxa" w:w="80"/>
+              <w:right w:type="dxa" w:w="120"/>
+            </w:tcMar>
+          </w:tcPr>
+          <w:p>
+            <w:pPr>
+              <w:spacing w:after="0" w:line="260"/>
+            </w:pPr>
+            <w:r>
+              <w:rPr>
+                <w:sz w:val="20"/>
+                <w:szCs w:val="20"/>
+              </w:rPr>
+              <w:t xml:space="preserve">In place</w:t>
+            </w:r>
+          </w:p>
+        </w:tc>
+        <w:tc>
+          <w:tcPr>
+            <w:tcW w:type="dxa" w:w="4760"/>
+            <w:tcMar>
+              <w:top w:type="dxa" w:w="80"/>
+              <w:left w:type="dxa" w:w="120"/>
+              <w:bottom w:type="dxa" w:w="80"/>
+              <w:right w:type="dxa" w:w="120"/>
+            </w:tcMar>
+          </w:tcPr>
+          <w:p>
+            <w:pPr>
+              <w:spacing w:after="0" w:line="260"/>
+            </w:pPr>
+            <w:r>
+              <w:rPr>
+                <w:sz w:val="20"/>
+                <w:szCs w:val="20"/>
+              </w:rPr>
+              <w:t xml:space="preserve">Nine tests, one per act of a reference scenario, producing a progression report generated from the graph rather than written by hand</w:t>
+            </w:r>
+          </w:p>
+        </w:tc>
+      </w:tr>
+      <w:tr>
+        <w:tc>
+          <w:tcPr>
+            <w:tcW w:type="dxa" w:w="2900"/>
+            <w:shd w:fill="F5F7FB" w:val="clear"/>
+            <w:tcMar>
+              <w:top w:type="dxa" w:w="80"/>
+              <w:left w:type="dxa" w:w="120"/>
+              <w:bottom w:type="dxa" w:w="80"/>
+              <w:right w:type="dxa" w:w="120"/>
+            </w:tcMar>
+          </w:tcPr>
+          <w:p>
+            <w:pPr>
+              <w:spacing w:after="0" w:line="260"/>
+            </w:pPr>
+            <w:r>
+              <w:rPr>
+                <w:sz w:val="20"/>
+                <w:szCs w:val="20"/>
+              </w:rPr>
+              <w:t xml:space="preserve">Local exchange mode</w:t>
+            </w:r>
+          </w:p>
+        </w:tc>
+        <w:tc>
+          <w:tcPr>
+            <w:tcW w:type="dxa" w:w="1700"/>
+            <w:shd w:fill="F5F7FB" w:val="clear"/>
+            <w:tcMar>
+              <w:top w:type="dxa" w:w="80"/>
+              <w:left w:type="dxa" w:w="120"/>
+              <w:bottom w:type="dxa" w:w="80"/>
+              <w:right w:type="dxa" w:w="120"/>
+            </w:tcMar>
+          </w:tcPr>
+          <w:p>
+            <w:pPr>
+              <w:spacing w:after="0" w:line="260"/>
+            </w:pPr>
+            <w:r>
+              <w:rPr>
+                <w:sz w:val="20"/>
+                <w:szCs w:val="20"/>
+              </w:rPr>
+              <w:t xml:space="preserve">Implemented</w:t>
+            </w:r>
+          </w:p>
+        </w:tc>
+        <w:tc>
+          <w:tcPr>
+            <w:tcW w:type="dxa" w:w="4760"/>
+            <w:shd w:fill="F5F7FB" w:val="clear"/>
+            <w:tcMar>
+              <w:top w:type="dxa" w:w="80"/>
+              <w:left w:type="dxa" w:w="120"/>
+              <w:bottom w:type="dxa" w:w="80"/>
+              <w:right w:type="dxa" w:w="120"/>
+            </w:tcMar>
+          </w:tcPr>
+          <w:p>
+            <w:pPr>
+              <w:spacing w:after="0" w:line="260"/>
+            </w:pPr>
+            <w:r>
+              <w:rPr>
+                <w:sz w:val="20"/>
+                <w:szCs w:val="20"/>
+              </w:rPr>
+              <w:t xml:space="preserve">Run the whole scenario on one machine, playing several roles, without any accounts to create</w:t>
+            </w:r>
+          </w:p>
+        </w:tc>
+      </w:tr>
+      <w:tr>
+        <w:tc>
+          <w:tcPr>
+            <w:tcW w:type="dxa" w:w="2900"/>
+            <w:tcMar>
+              <w:top w:type="dxa" w:w="80"/>
+              <w:left w:type="dxa" w:w="120"/>
+              <w:bottom w:type="dxa" w:w="80"/>
+              <w:right w:type="dxa" w:w="120"/>
+            </w:tcMar>
+          </w:tcPr>
+          <w:p>
+            <w:pPr>
+              <w:spacing w:after="0" w:line="260"/>
+            </w:pPr>
+            <w:r>
+              <w:rPr>
+                <w:sz w:val="20"/>
+                <w:szCs w:val="20"/>
+              </w:rPr>
+              <w:t xml:space="preserve">Mailbox rendering</w:t>
+            </w:r>
+          </w:p>
+        </w:tc>
+        <w:tc>
+          <w:tcPr>
+            <w:tcW w:type="dxa" w:w="1700"/>
+            <w:tcMar>
+              <w:top w:type="dxa" w:w="80"/>
+              <w:left w:type="dxa" w:w="120"/>
+              <w:bottom w:type="dxa" w:w="80"/>
+              <w:right w:type="dxa" w:w="120"/>
+            </w:tcMar>
+          </w:tcPr>
+          <w:p>
+            <w:pPr>
+              <w:spacing w:after="0" w:line="260"/>
+            </w:pPr>
+            <w:r>
+              <w:rPr>
+                <w:sz w:val="20"/>
+                <w:szCs w:val="20"/>
+              </w:rPr>
+              <w:t xml:space="preserve">Specified</w:t>
+            </w:r>
+          </w:p>
+        </w:tc>
+        <w:tc>
+          <w:tcPr>
+            <w:tcW w:type="dxa" w:w="4760"/>
+            <w:tcMar>
+              <w:top w:type="dxa" w:w="80"/>
+              <w:left w:type="dxa" w:w="120"/>
+              <w:bottom w:type="dxa" w:w="80"/>
+              <w:right w:type="dxa" w:w="120"/>
+            </w:tcMar>
+          </w:tcPr>
+          <w:p>
+            <w:pPr>
+              <w:spacing w:after="0" w:line="260"/>
+            </w:pPr>
+            <w:r>
+              <w:rPr>
+                <w:sz w:val="20"/>
+                <w:szCs w:val="20"/>
+              </w:rPr>
+              <w:t xml:space="preserve">The next increment: the same cards in issues, so contributors need install nothing</w:t>
+            </w:r>
+          </w:p>
+        </w:tc>
+      </w:tr>
+      <w:tr>
+        <w:tc>
+          <w:tcPr>
+            <w:tcW w:type="dxa" w:w="2900"/>
+            <w:shd w:fill="F5F7FB" w:val="clear"/>
+            <w:tcMar>
+              <w:top w:type="dxa" w:w="80"/>
+              <w:left w:type="dxa" w:w="120"/>
+              <w:bottom w:type="dxa" w:w="80"/>
+              <w:right w:type="dxa" w:w="120"/>
+            </w:tcMar>
+          </w:tcPr>
+          <w:p>
+            <w:pPr>
+              <w:spacing w:after="0" w:line="260"/>
+            </w:pPr>
+            <w:r>
+              <w:rPr>
+                <w:sz w:val="20"/>
+                <w:szCs w:val="20"/>
+              </w:rPr>
+              <w:t xml:space="preserve">Web interface</w:t>
+            </w:r>
+          </w:p>
+        </w:tc>
+        <w:tc>
+          <w:tcPr>
+            <w:tcW w:type="dxa" w:w="1700"/>
+            <w:shd w:fill="F5F7FB" w:val="clear"/>
+            <w:tcMar>
+              <w:top w:type="dxa" w:w="80"/>
+              <w:left w:type="dxa" w:w="120"/>
+              <w:bottom w:type="dxa" w:w="80"/>
+              <w:right w:type="dxa" w:w="120"/>
+            </w:tcMar>
+          </w:tcPr>
+          <w:p>
+            <w:pPr>
+              <w:spacing w:after="0" w:line="260"/>
+            </w:pPr>
+            <w:r>
+              <w:rPr>
+                <w:sz w:val="20"/>
+                <w:szCs w:val="20"/>
+              </w:rPr>
+              <w:t xml:space="preserve">Not started</w:t>
+            </w:r>
+          </w:p>
+        </w:tc>
+        <w:tc>
+          <w:tcPr>
+            <w:tcW w:type="dxa" w:w="4760"/>
+            <w:shd w:fill="F5F7FB" w:val="clear"/>
+            <w:tcMar>
+              <w:top w:type="dxa" w:w="80"/>
+              <w:left w:type="dxa" w:w="120"/>
+              <w:bottom w:type="dxa" w:w="80"/>
+              <w:right w:type="dxa" w:w="120"/>
+            </w:tcMar>
+          </w:tcPr>
+          <w:p>
+            <w:pPr>
+              <w:spacing w:after="0" w:line="260"/>
+            </w:pPr>
+            <w:r>
+              <w:rPr>
+                <w:sz w:val="20"/>
+                <w:szCs w:val="20"/>
+              </w:rPr>
+              <w:t xml:space="preserve">Deliberately. Three screens are sketched; they will be built when usage justifies them</w:t>
+            </w:r>
+          </w:p>
+        </w:tc>
+      </w:tr>
+    </w:tbl>
+    <w:p>
+      <w:pPr>
+        <w:spacing w:after="200"/>
+      </w:pPr>
+    </w:p>
+    <w:p>
+      <w:pPr>
+        <w:pStyle w:val="Heading2"/>
+        <w:spacing w:after="150" w:before="300"/>
+      </w:pPr>
+      <w:r>
+        <w:t xml:space="preserve">11.2 How we are testing our own claims</w:t>
+      </w:r>
+    </w:p>
+    <w:p>
+      <w:pPr>
+        <w:spacing w:after="150" w:line="300"/>
+        <w:jc w:val="both"/>
+      </w:pPr>
+      <w:r>
+        <w:rPr>
+          <w:sz w:val="22"/>
+          <w:szCs w:val="22"/>
+        </w:rPr>
+        <w:t xml:space="preserve">Two episodes are worth reporting, because they are the discipline rather than the result. The reference scenario was written as a narrative before any of it ran, and writing it exposed a real defect in the specification: the contradiction rule, as written, would not have detected the very conflict the story turns on. That is what a concrete narrative does that an abstract specification cannot. The scenario file now carries a banner saying it is fabricated, and a section listing where the real run is expected to diverge — written before the run, so it cannot be adjusted afterwards.</w:t>
+      </w:r>
+    </w:p>
+    <w:p>
+      <w:pPr>
+        <w:spacing w:after="150" w:line="300"/>
+        <w:jc w:val="both"/>
+      </w:pPr>
+      <w:r>
+        <w:rPr>
+          <w:sz w:val="22"/>
+          <w:szCs w:val="22"/>
+        </w:rPr>
+        <w:t xml:space="preserve">The acceptance suite follows the same rule. Its most important assertion is that the reference engagement must finish the run marked provisional: a system that reports a document complete when four subjects are still unframed is lying to its user, and a test that accepts it is complicit. Every board and diagram in the progression report is generated from the database, so the report cannot claim behaviour the code does not have.</w:t>
+      </w:r>
+    </w:p>
+    <w:p>
+      <w:pPr>
+        <w:spacing w:after="150" w:line="300"/>
+        <w:jc w:val="both"/>
+      </w:pPr>
+      <w:r>
+        <w:rPr>
+          <w:sz w:val="22"/>
+          <w:szCs w:val="22"/>
+        </w:rPr>
+        <w:t xml:space="preserve">Four things are genuinely unfinished. Subject normalisation across contributors is only partly addressed by serving canonical vocabulary with each question. Semantic coherence checking will raise false conflicts and miss real ones, which is why it is advisory and never a gate. The effort model carries no actuals yet, so it is an educated guess and is marked as such in its own metadata. And the growth curve of section 9 is a hypothesis until a second engagement tests it.</w:t>
+      </w:r>
+    </w:p>
+    <w:p>
+      <w:pPr>
+        <w:spacing w:after="150" w:line="300"/>
+        <w:jc w:val="both"/>
+      </w:pPr>
+      <w:r>
+        <w:rPr>
+          <w:sz w:val="22"/>
+          <w:szCs w:val="22"/>
+        </w:rPr>
+        <w:t xml:space="preserve">The failure mode to watch is not technical. It is a base that fills with drafts nobody promoted, and a harvest skipped because the phase ended and everyone moved on. The countermeasure is procedural rather than clever: the harvest is scheduled at phase kickoff, not at phase end, because an obligation that appears at the end is an obligation that gets skipped.</w:t>
+      </w:r>
+    </w:p>
+    <w:p>
+      <w:pPr>
+        <w:spacing w:after="150" w:line="300"/>
+        <w:jc w:val="both"/>
+      </w:pPr>
+      <w:r>
+        <w:rPr>
+          <w:sz w:val="22"/>
+          <w:szCs w:val="22"/>
+        </w:rPr>
+        <w:t xml:space="preserve">What this is not, in any state: an attempt to automate architecture. The system retrieves, structures, drafts, checks and asks. Judgement about what to promise, what to defer and what to refuse stays where it belongs. Nothing here removes the need for an architect; it removes the need for an architect to remember everything and to reason again through what has already been reasoned through.</w:t>
       </w:r>
     </w:p>
     <w:p>
@@ -2619,7 +5048,7 @@
         <w:spacing w:after="180" w:before="380"/>
       </w:pPr>
       <w:r>
-        <w:t xml:space="preserve">10. What this is not, and what is still unproven</w:t>
+        <w:t xml:space="preserve">12. Try it</w:t>
       </w:r>
     </w:p>
     <w:p>
@@ -2632,55 +5061,7 @@
           <w:sz w:val="22"/>
           <w:szCs w:val="22"/>
         </w:rPr>
-        <w:t xml:space="preserve">It is not an attempt to automate architecture. The system retrieves, structures, drafts, checks and asks. Judgement about what to promise, what to defer and what to refuse stays where it belongs. Nothing here removes the need for an architect; it removes the need for an architect to remember everything and to rewrite what has already been reasoned through.</w:t>
-      </w:r>
-    </w:p>
-    <w:p>
-      <w:pPr>
-        <w:spacing w:after="150" w:line="300"/>
-        <w:jc w:val="both"/>
-      </w:pPr>
-      <w:r>
-        <w:rPr>
-          <w:sz w:val="22"/>
-          <w:szCs w:val="22"/>
-        </w:rPr>
-        <w:t xml:space="preserve">Several things are honestly unfinished. Subject normalisation across contributors is the hardest problem and is only partly addressed by serving canonical vocabulary with each question. Semantic coherence checking will raise false conflicts and miss real ones, which is why it is advisory. The effort model currently carries no actuals, so it is an educated guess and is marked as such. And the elicitation model is specified and prototyped, not yet in service — the pipeline model is what works today.</w:t>
-      </w:r>
-    </w:p>
-    <w:p>
-      <w:pPr>
-        <w:spacing w:after="150" w:line="300"/>
-        <w:jc w:val="both"/>
-      </w:pPr>
-      <w:r>
-        <w:rPr>
-          <w:sz w:val="22"/>
-          <w:szCs w:val="22"/>
-        </w:rPr>
-        <w:t xml:space="preserve">The failure mode to watch is not technical. It is a base that fills with drafts nobody promoted, and a harvest ritual that is skipped because the phase ended and everyone moved on. The countermeasure is procedural: the harvest issue is opened at phase kickoff, not at phase end, because an obligation that appears at the end is an obligation that is skipped.</w:t>
-      </w:r>
-    </w:p>
-    <w:p>
-      <w:pPr>
-        <w:pStyle w:val="Heading1"/>
-        <w:spacing w:after="180" w:before="380"/>
-      </w:pPr>
-      <w:r>
-        <w:t xml:space="preserve">11. How to start</w:t>
-      </w:r>
-    </w:p>
-    <w:p>
-      <w:pPr>
-        <w:spacing w:after="150" w:line="300"/>
-        <w:jc w:val="both"/>
-      </w:pPr>
-      <w:r>
-        <w:rPr>
-          <w:sz w:val="22"/>
-          <w:szCs w:val="22"/>
-        </w:rPr>
-        <w:t xml:space="preserve">For a colleague who wants to use this on their next engagement, the sequence is short.</w:t>
+        <w:t xml:space="preserve">The cheapest way to find out whether this is useful to you costs about half a day and commits you to nothing.</w:t>
       </w:r>
     </w:p>
     <w:p>
@@ -2699,14 +5080,14 @@
           <w:sz w:val="22"/>
           <w:szCs w:val="22"/>
         </w:rPr>
-        <w:t xml:space="preserve">First — </w:t>
-      </w:r>
-      <w:r>
-        <w:rPr>
-          <w:sz w:val="22"/>
-          <w:szCs w:val="22"/>
-        </w:rPr>
-        <w:t xml:space="preserve">read the contribution guide; it answers what goes where, and when, in two pages.</w:t>
+        <w:t xml:space="preserve">Read the base — </w:t>
+      </w:r>
+      <w:r>
+        <w:rPr>
+          <w:sz w:val="22"/>
+          <w:szCs w:val="22"/>
+        </w:rPr>
+        <w:t xml:space="preserve">clone the repository and run the capability check. It talks to the knowledge server and tells you what it can and cannot do. Five minutes.</w:t>
       </w:r>
     </w:p>
     <w:p>
@@ -2725,14 +5106,14 @@
           <w:sz w:val="22"/>
           <w:szCs w:val="22"/>
         </w:rPr>
-        <w:t xml:space="preserve">Second — </w:t>
-      </w:r>
-      <w:r>
-        <w:rPr>
-          <w:sz w:val="22"/>
-          <w:szCs w:val="22"/>
-        </w:rPr>
-        <w:t xml:space="preserve">fill the engagement brief. It is the input people skip, and a thin brief produces a generic document no amount of prompting will rescue.</w:t>
+        <w:t xml:space="preserve">Describe your engagement — </w:t>
+      </w:r>
+      <w:r>
+        <w:rPr>
+          <w:sz w:val="22"/>
+          <w:szCs w:val="22"/>
+        </w:rPr>
+        <w:t xml:space="preserve">fill the engagement brief for something you are working on now: context, constraints, vendors, platforms, the questions you are still waiting on. This is the part people skip, and a thin brief produces a generic document that no amount of prompting will rescue. Two hours, and it is useful even if you stop there.</w:t>
       </w:r>
     </w:p>
     <w:p>
@@ -2751,14 +5132,14 @@
           <w:sz w:val="22"/>
           <w:szCs w:val="22"/>
         </w:rPr>
-        <w:t xml:space="preserve">Third — </w:t>
-      </w:r>
-      <w:r>
-        <w:rPr>
-          <w:sz w:val="22"/>
-          <w:szCs w:val="22"/>
-        </w:rPr>
-        <w:t xml:space="preserve">run the planning pass and read the gaps before drafting anything. That list is the most valuable output of the whole apparatus.</w:t>
+        <w:t xml:space="preserve">Ask it what is missing — </w:t>
+      </w:r>
+      <w:r>
+        <w:rPr>
+          <w:sz w:val="22"/>
+          <w:szCs w:val="22"/>
+        </w:rPr>
+        <w:t xml:space="preserve">run the planning pass and read the gap list. It will tell you what the base cannot cover, what your brief is missing, and which vendor answers you are quietly assuming. You get that before drafting a line.</w:t>
       </w:r>
     </w:p>
     <w:p>
@@ -2777,14 +5158,14 @@
           <w:sz w:val="22"/>
           <w:szCs w:val="22"/>
         </w:rPr>
-        <w:t xml:space="preserve">Fourth — </w:t>
-      </w:r>
-      <w:r>
-        <w:rPr>
-          <w:sz w:val="22"/>
-          <w:szCs w:val="22"/>
-        </w:rPr>
-        <w:t xml:space="preserve">when the phase ends, run the harvest. Record what the effort actually was and which risks actually materialised. Everything else in the base can be reconstructed by thinking harder; those two cannot.</w:t>
+        <w:t xml:space="preserve">Then decide — </w:t>
+      </w:r>
+      <w:r>
+        <w:rPr>
+          <w:sz w:val="22"/>
+          <w:szCs w:val="22"/>
+        </w:rPr>
+        <w:t xml:space="preserve">if the gap list was useful, draft a section and judge the prose. If it was not, tell us why — that is a more valuable contribution than a section.</w:t>
       </w:r>
     </w:p>
     <w:p>
@@ -2797,9 +5178,54 @@
           <w:sz w:val="22"/>
           <w:szCs w:val="22"/>
         </w:rPr>
-        <w:t xml:space="preserve">The base, the orchestrator, the knowledge server and the elicitation specification are in the repository. What is missing is use: the assets currently carry the reasoning of one engagement, and they only become a shared body of knowledge on the second.</w:t>
-      </w:r>
-    </w:p>
+        <w:t xml:space="preserve">For an engagement with several contributors, the elicitation prototype runs the three-architect scenario locally: one machine, several roles, nothing to install for anyone else. The system finds a gap, asks the cloud architect, shows what it intends to record, catches the storage expert contradicting them, and holds both positions until the chief architect arbitrates with a written reason. It is the fastest way to see whether the model matches how your team actually argues.</w:t>
+      </w:r>
+    </w:p>
+    <w:tbl>
+      <w:tblPr>
+        <w:tblW w:type="dxa" w:w="9360"/>
+        <w:tblBorders>
+          <w:top w:val="single" w:color="2E5496" w:sz="4"/>
+          <w:left w:val="single" w:color="2E5496" w:sz="14"/>
+          <w:bottom w:val="single" w:color="2E5496" w:sz="4"/>
+          <w:right w:val="single" w:color="2E5496" w:sz="4"/>
+          <w:insideH w:val="none"/>
+          <w:insideV w:val="none"/>
+        </w:tblBorders>
+      </w:tblPr>
+      <w:tblGrid>
+        <w:gridCol w:w="9360"/>
+      </w:tblGrid>
+      <w:tr>
+        <w:tc>
+          <w:tcPr>
+            <w:tcW w:type="dxa" w:w="9360"/>
+            <w:shd w:fill="EDF1F8" w:val="clear"/>
+            <w:tcMar>
+              <w:top w:type="dxa" w:w="140"/>
+              <w:left w:type="dxa" w:w="180"/>
+              <w:bottom w:type="dxa" w:w="140"/>
+              <w:right w:type="dxa" w:w="180"/>
+            </w:tcMar>
+          </w:tcPr>
+          <w:p>
+            <w:pPr>
+              <w:spacing w:after="0" w:line="290"/>
+            </w:pPr>
+            <w:r>
+              <w:rPr>
+                <w:i/>
+                <w:iCs/>
+                <w:color w:val="1F3864"/>
+                <w:sz w:val="22"/>
+                <w:szCs w:val="22"/>
+              </w:rPr>
+              <w:t xml:space="preserve">The assets currently carry the reasoning of a single engagement. They become a shared body of knowledge on the second — which is to say, when one of you tries this on something we have never seen.</w:t>
+            </w:r>
+          </w:p>
+        </w:tc>
+      </w:tr>
+    </w:tbl>
     <w:sectPr>
       <w:footerReference w:type="default" r:id="rId7"/>
       <w:pgSz w:w="11906" w:h="16838" w:orient="portrait"/>

</xml_diff>